<commit_message>
feat: organizaciones, seguridad de cuentas y sincronizacion multired
</commit_message>
<xml_diff>
--- a/docs/manuales/Manual-de-avance-Social-Audit-Pro.docx
+++ b/docs/manuales/Manual-de-avance-Social-Audit-Pro.docx
@@ -169,12 +169,7 @@
               <w:jc w:val="center"/>
             </w:pPr>
             <w:r>
-              <w:rPr>
-                <w:rFonts w:ascii="Arial" w:hAnsi="Arial"/>
-                <w:color w:val="000000"/>
-                <w:sz w:val="17"/>
-              </w:rPr>
-              <w:t>v0.4.0</w:t>
+              <w:t>v0.5.0</w:t>
             </w:r>
           </w:p>
         </w:tc>
@@ -223,12 +218,7 @@
               <w:spacing w:after="0"/>
             </w:pPr>
             <w:r>
-              <w:rPr>
-                <w:rFonts w:ascii="Arial" w:hAnsi="Arial"/>
-                <w:color w:val="000000"/>
-                <w:sz w:val="17"/>
-              </w:rPr>
-              <w:t>20 de septiembre de 2026</w:t>
+              <w:t>25 de septiembre de 2026</w:t>
             </w:r>
           </w:p>
         </w:tc>
@@ -250,12 +240,7 @@
               <w:spacing w:after="0"/>
             </w:pPr>
             <w:r>
-              <w:rPr>
-                <w:rFonts w:ascii="Arial" w:hAnsi="Arial"/>
-                <w:color w:val="000000"/>
-                <w:sz w:val="17"/>
-              </w:rPr>
-              <w:t>Commit de referencia</w:t>
+              <w:t>Referencia de avance</w:t>
             </w:r>
           </w:p>
         </w:tc>
@@ -276,12 +261,7 @@
               <w:jc w:val="center"/>
             </w:pPr>
             <w:r>
-              <w:rPr>
-                <w:rFonts w:ascii="Arial" w:hAnsi="Arial"/>
-                <w:color w:val="000000"/>
-                <w:sz w:val="17"/>
-              </w:rPr>
-              <w:t>ca1d24b</w:t>
+              <w:t>avance-011</w:t>
             </w:r>
           </w:p>
         </w:tc>
@@ -330,12 +310,7 @@
               <w:spacing w:after="0"/>
             </w:pPr>
             <w:r>
-              <w:rPr>
-                <w:rFonts w:ascii="Arial" w:hAnsi="Arial"/>
-                <w:color w:val="000000"/>
-                <w:sz w:val="17"/>
-              </w:rPr>
-              <w:t>MVP avanzado con primer OAuth oficial</w:t>
+              <w:t>MVP con organizaciones seguridad y sincronizacion</w:t>
             </w:r>
           </w:p>
         </w:tc>
@@ -531,22 +506,7 @@
         <w:spacing w:after="120"/>
       </w:pPr>
       <w:r>
-        <w:rPr>
-          <w:rFonts w:ascii="Arial" w:hAnsi="Arial"/>
-          <w:b/>
-        </w:rPr>
-        <w:t xml:space="preserve">Conclusion principal: </w:t>
-      </w:r>
-      <w:r>
-        <w:rPr>
-          <w:rFonts w:ascii="Arial" w:hAnsi="Arial"/>
-        </w:rPr>
-      </w:r>
-      <w:r>
-        <w:rPr>
-          <w:rFonts w:ascii="Arial" w:hAnsi="Arial"/>
-        </w:rPr>
-        <w:t>el MVP ya es funcional como sistema local y YouTube es la primera red con un conector OAuth oficial completo. Las demas redes permanecen preparadas visualmente, pero no se presentan como conectadas hasta disponer de sus credenciales y permisos oficiales.</w:t>
+        <w:t>Conclusion principal: el MVP local incluye organizaciones, MFA, correo, recuperacion y sincronizacion automatica. Los seis conectores estan implementados; la activacion y validacion real requieren credenciales y permisos oficiales.</w:t>
       </w:r>
     </w:p>
     <w:tbl>
@@ -1163,17 +1123,8 @@
             <w:vAlign w:val="center"/>
           </w:tcPr>
           <w:p>
-            <w:pPr>
-              <w:spacing w:after="0"/>
-              <w:jc w:val="center"/>
-            </w:pPr>
             <w:r>
-              <w:rPr>
-                <w:rFonts w:ascii="Arial" w:hAnsi="Arial"/>
-                <w:color w:val="000000"/>
-                <w:sz w:val="17"/>
-              </w:rPr>
-              <w:t>Pendiente</w:t>
+              <w:t>Codigo implementado</w:t>
             </w:r>
           </w:p>
         </w:tc>
@@ -2268,10 +2219,7 @@
         <w:spacing w:after="60"/>
       </w:pPr>
       <w:r>
-        <w:rPr>
-          <w:rFonts w:ascii="Arial" w:hAnsi="Arial"/>
-        </w:rPr>
-        <w:t>Permite conectar YouTube mediante OAuth oficial y sincronizar datos disponibles.</w:t>
+        <w:t>Incluye conectores para seis redes y sincronizacion programada, sujetos a credenciales y aprobacion.</w:t>
       </w:r>
     </w:p>
     <w:p>
@@ -3362,10 +3310,7 @@
         <w:spacing w:after="120"/>
       </w:pPr>
       <w:r>
-        <w:rPr>
-          <w:rFonts w:ascii="Arial" w:hAnsi="Arial"/>
-        </w:rPr>
-        <w:t>Las capturas siguientes corresponden a la version actual. Las cifras visibles en estas imagenes son demostrativas porque no se incluyeron credenciales personales en el repositorio.</w:t>
+        <w:t>Estas capturas conservan el recorrido visual de la linea base v0.4.0. El suplemento final explica las funciones de v0.5.0. Las cifras son demostrativas y no incluyen datos privados.</w:t>
       </w:r>
     </w:p>
     <w:p>
@@ -3508,10 +3453,7 @@
         <w:spacing w:after="120"/>
       </w:pPr>
       <w:r>
-        <w:rPr>
-          <w:rFonts w:ascii="Arial" w:hAnsi="Arial"/>
-        </w:rPr>
-        <w:t>La vista muestra el estado real de cada proveedor. YouTube dispone del flujo oficial; los demas proveedores permanecen sin configurar hasta contar con sus aplicaciones y permisos aprobados.</w:t>
+        <w:t>La vista muestra el estado de cada proveedor. Los seis conectores requieren aplicaciones y permisos aprobados para activarse. Los cinco adaptadores nuevos se validaron con respuestas simuladas.</w:t>
       </w:r>
     </w:p>
     <w:p>
@@ -4554,10 +4496,7 @@
         <w:spacing w:after="120"/>
       </w:pPr>
       <w:r>
-        <w:rPr>
-          <w:rFonts w:ascii="Arial" w:hAnsi="Arial"/>
-        </w:rPr>
-        <w:t>YouTube es la primera integracion implementada de extremo a extremo para validar el patron que utilizaran los proveedores restantes.</w:t>
+        <w:t>YouTube fue la primera integracion y establecio el patron compartido por los seis adaptadores actuales.</w:t>
       </w:r>
     </w:p>
     <w:p>
@@ -4658,10 +4597,7 @@
         <w:spacing w:after="60"/>
       </w:pPr>
       <w:r>
-        <w:rPr>
-          <w:rFonts w:ascii="Arial" w:hAnsi="Arial"/>
-        </w:rPr>
-        <w:t>Sincronizacion manual y actualizacion oficial de tokens.</w:t>
+        <w:t>Sincronizacion manual y programada con renovacion de tokens cuando el proveedor la admite.</w:t>
       </w:r>
     </w:p>
     <w:p>
@@ -4670,10 +4606,7 @@
         <w:spacing w:after="60"/>
       </w:pPr>
       <w:r>
-        <w:rPr>
-          <w:rFonts w:ascii="Arial" w:hAnsi="Arial"/>
-        </w:rPr>
-        <w:t>Sustitucion automatica de datos demo por datos oficiales para el usuario conectado.</w:t>
+        <w:t>Sustitucion de datos demo por datos oficiales de la organizacion activa.</w:t>
       </w:r>
     </w:p>
     <w:p>
@@ -5730,12 +5663,7 @@
               <w:spacing w:after="0"/>
             </w:pPr>
             <w:r>
-              <w:rPr>
-                <w:rFonts w:ascii="Arial" w:hAnsi="Arial"/>
-                <w:color w:val="000000"/>
-                <w:sz w:val="17"/>
-              </w:rPr>
-              <w:t>Aislamiento OAuth por usuario</w:t>
+              <w:t>Aislamiento por organizacion</w:t>
             </w:r>
           </w:p>
         </w:tc>
@@ -5910,17 +5838,8 @@
             <w:vAlign w:val="center"/>
           </w:tcPr>
           <w:p>
-            <w:pPr>
-              <w:spacing w:after="0"/>
-              <w:jc w:val="center"/>
-            </w:pPr>
             <w:r>
-              <w:rPr>
-                <w:rFonts w:ascii="Arial" w:hAnsi="Arial"/>
-                <w:color w:val="000000"/>
-                <w:sz w:val="17"/>
-              </w:rPr>
-              <w:t>Pendiente</w:t>
+              <w:t>Implementado</w:t>
             </w:r>
           </w:p>
         </w:tc>
@@ -5991,17 +5910,8 @@
             <w:shd w:fill="F7F8FC"/>
           </w:tcPr>
           <w:p>
-            <w:pPr>
-              <w:spacing w:after="0"/>
-              <w:jc w:val="center"/>
-            </w:pPr>
             <w:r>
-              <w:rPr>
-                <w:rFonts w:ascii="Arial" w:hAnsi="Arial"/>
-                <w:color w:val="000000"/>
-                <w:sz w:val="17"/>
-              </w:rPr>
-              <w:t>Pendiente</w:t>
+              <w:t>Implementado</w:t>
             </w:r>
           </w:p>
         </w:tc>
@@ -6137,10 +6047,7 @@
         <w:spacing w:after="120"/>
       </w:pPr>
       <w:r>
-        <w:rPr>
-          <w:rFonts w:ascii="Arial" w:hAnsi="Arial"/>
-        </w:rPr>
-        <w:t>El avance de YouTube fue validado con pruebas automaticas y revision visual. Las pruebas del proveedor usan una simulacion controlada para comprobar la aplicacion sin enviar credenciales reales a Google.</w:t>
+        <w:t>Las pruebas automaticas verifican analitica, API, seguridad, organizaciones, OAuth y sincronizacion. Los proveedores usan respuestas simuladas; falta validar cuentas reales con credenciales propias.</w:t>
       </w:r>
     </w:p>
     <w:tbl>
@@ -6257,12 +6164,7 @@
               <w:jc w:val="center"/>
             </w:pPr>
             <w:r>
-              <w:rPr>
-                <w:rFonts w:ascii="Arial" w:hAnsi="Arial"/>
-                <w:color w:val="000000"/>
-                <w:sz w:val="17"/>
-              </w:rPr>
-              <w:t>17 aprobadas</w:t>
+              <w:t>25 aprobadas</w:t>
             </w:r>
           </w:p>
         </w:tc>
@@ -6447,12 +6349,7 @@
               <w:spacing w:after="0"/>
             </w:pPr>
             <w:r>
-              <w:rPr>
-                <w:rFonts w:ascii="Arial" w:hAnsi="Arial"/>
-                <w:color w:val="000000"/>
-                <w:sz w:val="17"/>
-              </w:rPr>
-              <w:t>Aislamiento entre usuarios</w:t>
+              <w:t>Aislamiento entre organizaciones</w:t>
             </w:r>
           </w:p>
         </w:tc>
@@ -6739,16 +6636,8 @@
             <w:shd w:fill="F7F8FC"/>
           </w:tcPr>
           <w:p>
-            <w:pPr>
-              <w:spacing w:after="0"/>
-            </w:pPr>
             <w:r>
-              <w:rPr>
-                <w:rFonts w:ascii="Arial" w:hAnsi="Arial"/>
-                <w:color w:val="000000"/>
-                <w:sz w:val="17"/>
-              </w:rPr>
-              <w:t>0 vulnerabilidades conocidas</w:t>
+              <w:t>Revision adicional requerida</w:t>
             </w:r>
           </w:p>
         </w:tc>
@@ -6856,17 +6745,7 @@
         <w:spacing w:after="120"/>
       </w:pPr>
       <w:r>
-        <w:rPr>
-          <w:rFonts w:ascii="Arial" w:hAnsi="Arial"/>
-          <w:b/>
-        </w:rPr>
-        <w:t xml:space="preserve">Commit actual: </w:t>
-      </w:r>
-      <w:r>
-        <w:rPr>
-          <w:rFonts w:ascii="Arial" w:hAnsi="Arial"/>
-        </w:rPr>
-        <w:t>ca1d24b feat integrar OAuth oficial de YouTube.</w:t>
+        <w:t>Referencia actual: docs/avances/avance-011.md y CHANGELOG v0.5.0.</w:t>
       </w:r>
     </w:p>
     <w:p>
@@ -7860,10 +7739,7 @@
         <w:spacing w:after="120"/>
       </w:pPr>
       <w:r>
-        <w:rPr>
-          <w:rFonts w:ascii="Arial" w:hAnsi="Arial"/>
-        </w:rPr>
-        <w:t>La siguiente etapa no debe reconstruir el dashboard. Debe reutilizar el patron validado con YouTube y avanzar por proveedor conforme se obtengan credenciales y permisos oficiales.</w:t>
+        <w:t>La siguiente etapa requiere activar y validar los proveedores, configurar SMTP y elegir infraestructura productiva con base compartida.</w:t>
       </w:r>
     </w:p>
     <w:tbl>
@@ -7978,15 +7854,7 @@
             <w:vAlign w:val="center"/>
           </w:tcPr>
           <w:p>
-            <w:pPr>
-              <w:spacing w:after="0"/>
-            </w:pPr>
             <w:r>
-              <w:rPr>
-                <w:rFonts w:ascii="Arial" w:hAnsi="Arial"/>
-                <w:color w:val="000000"/>
-                <w:sz w:val="17"/>
-              </w:rPr>
               <w:t>1</w:t>
             </w:r>
           </w:p>
@@ -8003,16 +7871,8 @@
             <w:vAlign w:val="center"/>
           </w:tcPr>
           <w:p>
-            <w:pPr>
-              <w:spacing w:after="0"/>
-            </w:pPr>
             <w:r>
-              <w:rPr>
-                <w:rFonts w:ascii="Arial" w:hAnsi="Arial"/>
-                <w:color w:val="000000"/>
-                <w:sz w:val="17"/>
-              </w:rPr>
-              <w:t>Validar YouTube con credenciales y una cuenta real</w:t>
+              <w:t>Validar YouTube con una cuenta real</w:t>
             </w:r>
           </w:p>
         </w:tc>
@@ -8028,16 +7888,8 @@
             <w:vAlign w:val="center"/>
           </w:tcPr>
           <w:p>
-            <w:pPr>
-              <w:spacing w:after="0"/>
-            </w:pPr>
             <w:r>
-              <w:rPr>
-                <w:rFonts w:ascii="Arial" w:hAnsi="Arial"/>
-                <w:color w:val="000000"/>
-                <w:sz w:val="17"/>
-              </w:rPr>
-              <w:t>Proyecto Google y usuario de prueba</w:t>
+              <w:t>Credenciales Google</w:t>
             </w:r>
           </w:p>
         </w:tc>
@@ -8056,15 +7908,7 @@
             <w:shd w:fill="F7F8FC"/>
           </w:tcPr>
           <w:p>
-            <w:pPr>
-              <w:spacing w:after="0"/>
-            </w:pPr>
             <w:r>
-              <w:rPr>
-                <w:rFonts w:ascii="Arial" w:hAnsi="Arial"/>
-                <w:color w:val="000000"/>
-                <w:sz w:val="17"/>
-              </w:rPr>
               <w:t>2</w:t>
             </w:r>
           </w:p>
@@ -8082,16 +7926,8 @@
             <w:shd w:fill="F7F8FC"/>
           </w:tcPr>
           <w:p>
-            <w:pPr>
-              <w:spacing w:after="0"/>
-            </w:pPr>
             <w:r>
-              <w:rPr>
-                <w:rFonts w:ascii="Arial" w:hAnsi="Arial"/>
-                <w:color w:val="000000"/>
-                <w:sz w:val="17"/>
-              </w:rPr>
-              <w:t>Implementar Meta para Facebook e Instagram</w:t>
+              <w:t>Activar Facebook e Instagram</w:t>
             </w:r>
           </w:p>
         </w:tc>
@@ -8108,16 +7944,8 @@
             <w:shd w:fill="F7F8FC"/>
           </w:tcPr>
           <w:p>
-            <w:pPr>
-              <w:spacing w:after="0"/>
-            </w:pPr>
             <w:r>
-              <w:rPr>
-                <w:rFonts w:ascii="Arial" w:hAnsi="Arial"/>
-                <w:color w:val="000000"/>
-                <w:sz w:val="17"/>
-              </w:rPr>
-              <w:t>Aplicacion Meta y permisos aprobados</w:t>
+              <w:t>App Meta aprobada</w:t>
             </w:r>
           </w:p>
         </w:tc>
@@ -8135,15 +7963,7 @@
             <w:vAlign w:val="center"/>
           </w:tcPr>
           <w:p>
-            <w:pPr>
-              <w:spacing w:after="0"/>
-            </w:pPr>
             <w:r>
-              <w:rPr>
-                <w:rFonts w:ascii="Arial" w:hAnsi="Arial"/>
-                <w:color w:val="000000"/>
-                <w:sz w:val="17"/>
-              </w:rPr>
               <w:t>3</w:t>
             </w:r>
           </w:p>
@@ -8160,16 +7980,8 @@
             <w:vAlign w:val="center"/>
           </w:tcPr>
           <w:p>
-            <w:pPr>
-              <w:spacing w:after="0"/>
-            </w:pPr>
             <w:r>
-              <w:rPr>
-                <w:rFonts w:ascii="Arial" w:hAnsi="Arial"/>
-                <w:color w:val="000000"/>
-                <w:sz w:val="17"/>
-              </w:rPr>
-              <w:t>Implementar TikTok LinkedIn y X</w:t>
+              <w:t>Activar TikTok LinkedIn y X</w:t>
             </w:r>
           </w:p>
         </w:tc>
@@ -8185,16 +7997,8 @@
             <w:vAlign w:val="center"/>
           </w:tcPr>
           <w:p>
-            <w:pPr>
-              <w:spacing w:after="0"/>
-            </w:pPr>
             <w:r>
-              <w:rPr>
-                <w:rFonts w:ascii="Arial" w:hAnsi="Arial"/>
-                <w:color w:val="000000"/>
-                <w:sz w:val="17"/>
-              </w:rPr>
-              <w:t>Acceso oficial de cada proveedor</w:t>
+              <w:t>Acceso oficial y cuotas</w:t>
             </w:r>
           </w:p>
         </w:tc>
@@ -8213,15 +8017,7 @@
             <w:shd w:fill="F7F8FC"/>
           </w:tcPr>
           <w:p>
-            <w:pPr>
-              <w:spacing w:after="0"/>
-            </w:pPr>
             <w:r>
-              <w:rPr>
-                <w:rFonts w:ascii="Arial" w:hAnsi="Arial"/>
-                <w:color w:val="000000"/>
-                <w:sz w:val="17"/>
-              </w:rPr>
               <w:t>4</w:t>
             </w:r>
           </w:p>
@@ -8239,16 +8035,8 @@
             <w:shd w:fill="F7F8FC"/>
           </w:tcPr>
           <w:p>
-            <w:pPr>
-              <w:spacing w:after="0"/>
-            </w:pPr>
             <w:r>
-              <w:rPr>
-                <w:rFonts w:ascii="Arial" w:hAnsi="Arial"/>
-                <w:color w:val="000000"/>
-                <w:sz w:val="17"/>
-              </w:rPr>
-              <w:t>Programar sincronizaciones y reintentos</w:t>
+              <w:t>Validar tareas con proveedores reales</w:t>
             </w:r>
           </w:p>
         </w:tc>
@@ -8265,16 +8053,8 @@
             <w:shd w:fill="F7F8FC"/>
           </w:tcPr>
           <w:p>
-            <w:pPr>
-              <w:spacing w:after="0"/>
-            </w:pPr>
             <w:r>
-              <w:rPr>
-                <w:rFonts w:ascii="Arial" w:hAnsi="Arial"/>
-                <w:color w:val="000000"/>
-                <w:sz w:val="17"/>
-              </w:rPr>
-              <w:t>Politica de frecuencia y cuotas</w:t>
+              <w:t>Credenciales y limites</w:t>
             </w:r>
           </w:p>
         </w:tc>
@@ -8292,15 +8072,7 @@
             <w:vAlign w:val="center"/>
           </w:tcPr>
           <w:p>
-            <w:pPr>
-              <w:spacing w:after="0"/>
-            </w:pPr>
             <w:r>
-              <w:rPr>
-                <w:rFonts w:ascii="Arial" w:hAnsi="Arial"/>
-                <w:color w:val="000000"/>
-                <w:sz w:val="17"/>
-              </w:rPr>
               <w:t>5</w:t>
             </w:r>
           </w:p>
@@ -8317,16 +8089,8 @@
             <w:vAlign w:val="center"/>
           </w:tcPr>
           <w:p>
-            <w:pPr>
-              <w:spacing w:after="0"/>
-            </w:pPr>
             <w:r>
-              <w:rPr>
-                <w:rFonts w:ascii="Arial" w:hAnsi="Arial"/>
-                <w:color w:val="000000"/>
-                <w:sz w:val="17"/>
-              </w:rPr>
-              <w:t>Agregar desconexion y revocacion</w:t>
+              <w:t>Completar desconexion y revocacion</w:t>
             </w:r>
           </w:p>
         </w:tc>
@@ -8342,16 +8106,8 @@
             <w:vAlign w:val="center"/>
           </w:tcPr>
           <w:p>
-            <w:pPr>
-              <w:spacing w:after="0"/>
-            </w:pPr>
             <w:r>
-              <w:rPr>
-                <w:rFonts w:ascii="Arial" w:hAnsi="Arial"/>
-                <w:color w:val="000000"/>
-                <w:sz w:val="17"/>
-              </w:rPr>
-              <w:t>Endpoints oficiales de cada red</w:t>
+              <w:t>Endpoints de cada red</w:t>
             </w:r>
           </w:p>
         </w:tc>
@@ -8370,15 +8126,7 @@
             <w:shd w:fill="F7F8FC"/>
           </w:tcPr>
           <w:p>
-            <w:pPr>
-              <w:spacing w:after="0"/>
-            </w:pPr>
             <w:r>
-              <w:rPr>
-                <w:rFonts w:ascii="Arial" w:hAnsi="Arial"/>
-                <w:color w:val="000000"/>
-                <w:sz w:val="17"/>
-              </w:rPr>
               <w:t>6</w:t>
             </w:r>
           </w:p>
@@ -8396,16 +8144,8 @@
             <w:shd w:fill="F7F8FC"/>
           </w:tcPr>
           <w:p>
-            <w:pPr>
-              <w:spacing w:after="0"/>
-            </w:pPr>
             <w:r>
-              <w:rPr>
-                <w:rFonts w:ascii="Arial" w:hAnsi="Arial"/>
-                <w:color w:val="000000"/>
-                <w:sz w:val="17"/>
-              </w:rPr>
-              <w:t>Crear organizaciones y clientes</w:t>
+              <w:t>Migrar a PostgreSQL y cola compartida</w:t>
             </w:r>
           </w:p>
         </w:tc>
@@ -8422,16 +8162,8 @@
             <w:shd w:fill="F7F8FC"/>
           </w:tcPr>
           <w:p>
-            <w:pPr>
-              <w:spacing w:after="0"/>
-            </w:pPr>
             <w:r>
-              <w:rPr>
-                <w:rFonts w:ascii="Arial" w:hAnsi="Arial"/>
-                <w:color w:val="000000"/>
-                <w:sz w:val="17"/>
-              </w:rPr>
-              <w:t>Reglas de propiedad y colaboracion</w:t>
+              <w:t>Infraestructura elegida</w:t>
             </w:r>
           </w:p>
         </w:tc>
@@ -8449,15 +8181,7 @@
             <w:vAlign w:val="center"/>
           </w:tcPr>
           <w:p>
-            <w:pPr>
-              <w:spacing w:after="0"/>
-            </w:pPr>
             <w:r>
-              <w:rPr>
-                <w:rFonts w:ascii="Arial" w:hAnsi="Arial"/>
-                <w:color w:val="000000"/>
-                <w:sz w:val="17"/>
-              </w:rPr>
               <w:t>7</w:t>
             </w:r>
           </w:p>
@@ -8474,16 +8198,8 @@
             <w:vAlign w:val="center"/>
           </w:tcPr>
           <w:p>
-            <w:pPr>
-              <w:spacing w:after="0"/>
-            </w:pPr>
             <w:r>
-              <w:rPr>
-                <w:rFonts w:ascii="Arial" w:hAnsi="Arial"/>
-                <w:color w:val="000000"/>
-                <w:sz w:val="17"/>
-              </w:rPr>
-              <w:t>Recuperacion de contrasena y MFA</w:t>
+              <w:t>Activar SMTP y probar entrega</w:t>
             </w:r>
           </w:p>
         </w:tc>
@@ -8499,16 +8215,8 @@
             <w:vAlign w:val="center"/>
           </w:tcPr>
           <w:p>
-            <w:pPr>
-              <w:spacing w:after="0"/>
-            </w:pPr>
             <w:r>
-              <w:rPr>
-                <w:rFonts w:ascii="Arial" w:hAnsi="Arial"/>
-                <w:color w:val="000000"/>
-                <w:sz w:val="17"/>
-              </w:rPr>
-              <w:t>Servicio de correo y politica de seguridad</w:t>
+              <w:t>Servicio de correo</w:t>
             </w:r>
           </w:p>
         </w:tc>
@@ -8527,15 +8235,7 @@
             <w:shd w:fill="F7F8FC"/>
           </w:tcPr>
           <w:p>
-            <w:pPr>
-              <w:spacing w:after="0"/>
-            </w:pPr>
             <w:r>
-              <w:rPr>
-                <w:rFonts w:ascii="Arial" w:hAnsi="Arial"/>
-                <w:color w:val="000000"/>
-                <w:sz w:val="17"/>
-              </w:rPr>
               <w:t>8</w:t>
             </w:r>
           </w:p>
@@ -8553,15 +8253,7 @@
             <w:shd w:fill="F7F8FC"/>
           </w:tcPr>
           <w:p>
-            <w:pPr>
-              <w:spacing w:after="0"/>
-            </w:pPr>
             <w:r>
-              <w:rPr>
-                <w:rFonts w:ascii="Arial" w:hAnsi="Arial"/>
-                <w:color w:val="000000"/>
-                <w:sz w:val="17"/>
-              </w:rPr>
               <w:t>Desplegar backend en HTTPS</w:t>
             </w:r>
           </w:p>
@@ -8579,16 +8271,8 @@
             <w:shd w:fill="F7F8FC"/>
           </w:tcPr>
           <w:p>
-            <w:pPr>
-              <w:spacing w:after="0"/>
-            </w:pPr>
             <w:r>
-              <w:rPr>
-                <w:rFonts w:ascii="Arial" w:hAnsi="Arial"/>
-                <w:color w:val="000000"/>
-                <w:sz w:val="17"/>
-              </w:rPr>
-              <w:t>Infraestructura persistente</w:t>
+              <w:t>Host dominio y secretos</w:t>
             </w:r>
           </w:p>
         </w:tc>
@@ -8661,10 +8345,7 @@
         <w:spacing w:after="60"/>
       </w:pPr>
       <w:r>
-        <w:rPr>
-          <w:rFonts w:ascii="Arial" w:hAnsi="Arial"/>
-        </w:rPr>
-        <w:t>No reemplazar SQLite durante el MVP sin una necesidad demostrada.</w:t>
+        <w:t>Migrar SQLite a una base compartida antes de ejecutar multiples servidores.</w:t>
       </w:r>
     </w:p>
     <w:p>
@@ -9747,10 +9428,1814 @@
         <w:spacing w:after="20"/>
       </w:pPr>
     </w:p>
+    <w:p>
+      <w:r>
+        <w:br w:type="page"/>
+      </w:r>
+    </w:p>
+    <w:p>
+      <w:pPr>
+        <w:spacing w:after="80"/>
+      </w:pPr>
+      <w:r>
+        <w:rPr>
+          <w:rFonts w:ascii="Arial" w:hAnsi="Arial"/>
+          <w:b/>
+          <w:color w:val="2F7D78"/>
+          <w:sz w:val="18"/>
+        </w:rPr>
+        <w:t>ACTUALIZACION DEL ESTADO</w:t>
+      </w:r>
+    </w:p>
+    <w:p>
+      <w:pPr>
+        <w:pStyle w:val="Heading1"/>
+      </w:pPr>
+      <w:r>
+        <w:t>Actualizacion v0.5.0</w:t>
+      </w:r>
+    </w:p>
+    <w:p>
+      <w:r>
+        <w:t>El sistema local incorpora organizaciones, seguridad de cuenta, sincronizacion programada y adaptadores para las seis redes. Este suplemento detalla el avance v0.5.0. GitHub Pages sigue siendo una demostracion estatica.</w:t>
+      </w:r>
+    </w:p>
+    <w:p>
+      <w:pPr>
+        <w:pStyle w:val="Heading2"/>
+      </w:pPr>
+      <w:r>
+        <w:t>Capacidades incorporadas</w:t>
+      </w:r>
+    </w:p>
+    <w:tbl>
+      <w:tblPr>
+        <w:tblW w:type="auto" w:w="0"/>
+        <w:jc w:val="center"/>
+        <w:tblLayout w:type="fixed"/>
+        <w:tblLook w:firstColumn="1" w:firstRow="1" w:lastColumn="0" w:lastRow="0" w:noHBand="0" w:noVBand="1" w:val="04A0"/>
+        <w:tblBorders>
+          <w:top w:val="single" w:sz="6" w:color="D9D9D9"/>
+          <w:left w:val="single" w:sz="6" w:color="D9D9D9"/>
+          <w:bottom w:val="single" w:sz="6" w:color="D9D9D9"/>
+          <w:right w:val="single" w:sz="6" w:color="D9D9D9"/>
+          <w:insideH w:val="single" w:sz="6" w:color="D9D9D9"/>
+          <w:insideV w:val="single" w:sz="6" w:color="D9D9D9"/>
+        </w:tblBorders>
+      </w:tblPr>
+      <w:tblGrid>
+        <w:gridCol w:w="3331"/>
+        <w:gridCol w:w="3331"/>
+        <w:gridCol w:w="3331"/>
+      </w:tblGrid>
+      <w:tr>
+        <w:trPr>
+          <w:tblHeader/>
+          <w:cantSplit/>
+        </w:trPr>
+        <w:tc>
+          <w:tcPr>
+            <w:tcW w:type="dxa" w:w="1944"/>
+            <w:vAlign w:val="center"/>
+            <w:tcMar>
+              <w:top w:w="120" w:type="dxa"/>
+              <w:start w:w="140" w:type="dxa"/>
+              <w:bottom w:w="120" w:type="dxa"/>
+              <w:end w:w="140" w:type="dxa"/>
+            </w:tcMar>
+            <w:shd w:fill="17324D"/>
+          </w:tcPr>
+          <w:p>
+            <w:pPr>
+              <w:spacing w:after="0"/>
+            </w:pPr>
+            <w:r>
+              <w:rPr>
+                <w:rFonts w:ascii="Arial" w:hAnsi="Arial"/>
+                <w:b/>
+                <w:color w:val="FFFFFF"/>
+                <w:sz w:val="18"/>
+              </w:rPr>
+              <w:t>Area</w:t>
+            </w:r>
+          </w:p>
+        </w:tc>
+        <w:tc>
+          <w:tcPr>
+            <w:tcW w:type="dxa" w:w="4536"/>
+            <w:vAlign w:val="center"/>
+            <w:tcMar>
+              <w:top w:w="120" w:type="dxa"/>
+              <w:start w:w="140" w:type="dxa"/>
+              <w:bottom w:w="120" w:type="dxa"/>
+              <w:end w:w="140" w:type="dxa"/>
+            </w:tcMar>
+            <w:shd w:fill="17324D"/>
+          </w:tcPr>
+          <w:p>
+            <w:pPr>
+              <w:spacing w:after="0"/>
+            </w:pPr>
+            <w:r>
+              <w:rPr>
+                <w:rFonts w:ascii="Arial" w:hAnsi="Arial"/>
+                <w:b/>
+                <w:color w:val="FFFFFF"/>
+                <w:sz w:val="18"/>
+              </w:rPr>
+              <w:t>Estado en v0.5.0</w:t>
+            </w:r>
+          </w:p>
+        </w:tc>
+        <w:tc>
+          <w:tcPr>
+            <w:tcW w:type="dxa" w:w="3096"/>
+            <w:vAlign w:val="center"/>
+            <w:tcMar>
+              <w:top w:w="120" w:type="dxa"/>
+              <w:start w:w="140" w:type="dxa"/>
+              <w:bottom w:w="120" w:type="dxa"/>
+              <w:end w:w="140" w:type="dxa"/>
+            </w:tcMar>
+            <w:shd w:fill="17324D"/>
+          </w:tcPr>
+          <w:p>
+            <w:pPr>
+              <w:spacing w:after="0"/>
+            </w:pPr>
+            <w:r>
+              <w:rPr>
+                <w:rFonts w:ascii="Arial" w:hAnsi="Arial"/>
+                <w:b/>
+                <w:color w:val="FFFFFF"/>
+                <w:sz w:val="18"/>
+              </w:rPr>
+              <w:t>Evidencia</w:t>
+            </w:r>
+          </w:p>
+        </w:tc>
+      </w:tr>
+      <w:tr>
+        <w:trPr>
+          <w:cantSplit/>
+        </w:trPr>
+        <w:tc>
+          <w:tcPr>
+            <w:tcW w:type="dxa" w:w="1944"/>
+            <w:vAlign w:val="center"/>
+            <w:tcMar>
+              <w:top w:w="120" w:type="dxa"/>
+              <w:start w:w="140" w:type="dxa"/>
+              <w:bottom w:w="120" w:type="dxa"/>
+              <w:end w:w="140" w:type="dxa"/>
+            </w:tcMar>
+            <w:shd w:fill="FFFFFF"/>
+          </w:tcPr>
+          <w:p>
+            <w:pPr>
+              <w:spacing w:after="0"/>
+            </w:pPr>
+            <w:r>
+              <w:rPr>
+                <w:rFonts w:ascii="Arial" w:hAnsi="Arial"/>
+                <w:sz w:val="18"/>
+              </w:rPr>
+              <w:t>Organizaciones</w:t>
+            </w:r>
+          </w:p>
+        </w:tc>
+        <w:tc>
+          <w:tcPr>
+            <w:tcW w:type="dxa" w:w="4536"/>
+            <w:vAlign w:val="center"/>
+            <w:tcMar>
+              <w:top w:w="120" w:type="dxa"/>
+              <w:start w:w="140" w:type="dxa"/>
+              <w:bottom w:w="120" w:type="dxa"/>
+              <w:end w:w="140" w:type="dxa"/>
+            </w:tcMar>
+            <w:shd w:fill="FFFFFF"/>
+          </w:tcPr>
+          <w:p>
+            <w:pPr>
+              <w:spacing w:after="0"/>
+            </w:pPr>
+            <w:r>
+              <w:rPr>
+                <w:rFonts w:ascii="Arial" w:hAnsi="Arial"/>
+                <w:sz w:val="18"/>
+              </w:rPr>
+              <w:t>Membresias, seleccion de contexto y filtros por organizacion</w:t>
+            </w:r>
+          </w:p>
+        </w:tc>
+        <w:tc>
+          <w:tcPr>
+            <w:tcW w:type="dxa" w:w="3096"/>
+            <w:vAlign w:val="center"/>
+            <w:tcMar>
+              <w:top w:w="120" w:type="dxa"/>
+              <w:start w:w="140" w:type="dxa"/>
+              <w:bottom w:w="120" w:type="dxa"/>
+              <w:end w:w="140" w:type="dxa"/>
+            </w:tcMar>
+            <w:shd w:fill="FFFFFF"/>
+          </w:tcPr>
+          <w:p>
+            <w:pPr>
+              <w:spacing w:after="0"/>
+            </w:pPr>
+            <w:r>
+              <w:rPr>
+                <w:rFonts w:ascii="Arial" w:hAnsi="Arial"/>
+                <w:sz w:val="18"/>
+              </w:rPr>
+              <w:t>Migracion 003 y rutas de organizaciones</w:t>
+            </w:r>
+          </w:p>
+        </w:tc>
+      </w:tr>
+      <w:tr>
+        <w:trPr>
+          <w:cantSplit/>
+        </w:trPr>
+        <w:tc>
+          <w:tcPr>
+            <w:tcW w:type="dxa" w:w="1944"/>
+            <w:vAlign w:val="center"/>
+            <w:tcMar>
+              <w:top w:w="120" w:type="dxa"/>
+              <w:start w:w="140" w:type="dxa"/>
+              <w:bottom w:w="120" w:type="dxa"/>
+              <w:end w:w="140" w:type="dxa"/>
+            </w:tcMar>
+            <w:shd w:fill="EEF3F8"/>
+          </w:tcPr>
+          <w:p>
+            <w:pPr>
+              <w:spacing w:after="0"/>
+            </w:pPr>
+            <w:r>
+              <w:rPr>
+                <w:rFonts w:ascii="Arial" w:hAnsi="Arial"/>
+                <w:sz w:val="18"/>
+              </w:rPr>
+              <w:t>Seguridad</w:t>
+            </w:r>
+          </w:p>
+        </w:tc>
+        <w:tc>
+          <w:tcPr>
+            <w:tcW w:type="dxa" w:w="4536"/>
+            <w:vAlign w:val="center"/>
+            <w:tcMar>
+              <w:top w:w="120" w:type="dxa"/>
+              <w:start w:w="140" w:type="dxa"/>
+              <w:bottom w:w="120" w:type="dxa"/>
+              <w:end w:w="140" w:type="dxa"/>
+            </w:tcMar>
+            <w:shd w:fill="EEF3F8"/>
+          </w:tcPr>
+          <w:p>
+            <w:pPr>
+              <w:spacing w:after="0"/>
+            </w:pPr>
+            <w:r>
+              <w:rPr>
+                <w:rFonts w:ascii="Arial" w:hAnsi="Arial"/>
+                <w:sz w:val="18"/>
+              </w:rPr>
+              <w:t>Verificacion, recuperacion y MFA TOTP</w:t>
+            </w:r>
+          </w:p>
+        </w:tc>
+        <w:tc>
+          <w:tcPr>
+            <w:tcW w:type="dxa" w:w="3096"/>
+            <w:vAlign w:val="center"/>
+            <w:tcMar>
+              <w:top w:w="120" w:type="dxa"/>
+              <w:start w:w="140" w:type="dxa"/>
+              <w:bottom w:w="120" w:type="dxa"/>
+              <w:end w:w="140" w:type="dxa"/>
+            </w:tcMar>
+            <w:shd w:fill="EEF3F8"/>
+          </w:tcPr>
+          <w:p>
+            <w:pPr>
+              <w:spacing w:after="0"/>
+            </w:pPr>
+            <w:r>
+              <w:rPr>
+                <w:rFonts w:ascii="Arial" w:hAnsi="Arial"/>
+                <w:sz w:val="18"/>
+              </w:rPr>
+              <w:t>Migracion 005 y pruebas de cuenta</w:t>
+            </w:r>
+          </w:p>
+        </w:tc>
+      </w:tr>
+      <w:tr>
+        <w:trPr>
+          <w:cantSplit/>
+        </w:trPr>
+        <w:tc>
+          <w:tcPr>
+            <w:tcW w:type="dxa" w:w="1944"/>
+            <w:vAlign w:val="center"/>
+            <w:tcMar>
+              <w:top w:w="120" w:type="dxa"/>
+              <w:start w:w="140" w:type="dxa"/>
+              <w:bottom w:w="120" w:type="dxa"/>
+              <w:end w:w="140" w:type="dxa"/>
+            </w:tcMar>
+            <w:shd w:fill="FFFFFF"/>
+          </w:tcPr>
+          <w:p>
+            <w:pPr>
+              <w:spacing w:after="0"/>
+            </w:pPr>
+            <w:r>
+              <w:rPr>
+                <w:rFonts w:ascii="Arial" w:hAnsi="Arial"/>
+                <w:sz w:val="18"/>
+              </w:rPr>
+              <w:t>Sincronizacion</w:t>
+            </w:r>
+          </w:p>
+        </w:tc>
+        <w:tc>
+          <w:tcPr>
+            <w:tcW w:type="dxa" w:w="4536"/>
+            <w:vAlign w:val="center"/>
+            <w:tcMar>
+              <w:top w:w="120" w:type="dxa"/>
+              <w:start w:w="140" w:type="dxa"/>
+              <w:bottom w:w="120" w:type="dxa"/>
+              <w:end w:w="140" w:type="dxa"/>
+            </w:tcMar>
+            <w:shd w:fill="FFFFFF"/>
+          </w:tcPr>
+          <w:p>
+            <w:pPr>
+              <w:spacing w:after="0"/>
+            </w:pPr>
+            <w:r>
+              <w:rPr>
+                <w:rFonts w:ascii="Arial" w:hAnsi="Arial"/>
+                <w:sz w:val="18"/>
+              </w:rPr>
+              <w:t>Intervalos configurables y trabajador con arrendamiento</w:t>
+            </w:r>
+          </w:p>
+        </w:tc>
+        <w:tc>
+          <w:tcPr>
+            <w:tcW w:type="dxa" w:w="3096"/>
+            <w:vAlign w:val="center"/>
+            <w:tcMar>
+              <w:top w:w="120" w:type="dxa"/>
+              <w:start w:w="140" w:type="dxa"/>
+              <w:bottom w:w="120" w:type="dxa"/>
+              <w:end w:w="140" w:type="dxa"/>
+            </w:tcMar>
+            <w:shd w:fill="FFFFFF"/>
+          </w:tcPr>
+          <w:p>
+            <w:pPr>
+              <w:spacing w:after="0"/>
+            </w:pPr>
+            <w:r>
+              <w:rPr>
+                <w:rFonts w:ascii="Arial" w:hAnsi="Arial"/>
+                <w:sz w:val="18"/>
+              </w:rPr>
+              <w:t>sync-worker.js y prueba de ejecucion unica</w:t>
+            </w:r>
+          </w:p>
+        </w:tc>
+      </w:tr>
+      <w:tr>
+        <w:trPr>
+          <w:cantSplit/>
+        </w:trPr>
+        <w:tc>
+          <w:tcPr>
+            <w:tcW w:type="dxa" w:w="1944"/>
+            <w:vAlign w:val="center"/>
+            <w:tcMar>
+              <w:top w:w="120" w:type="dxa"/>
+              <w:start w:w="140" w:type="dxa"/>
+              <w:bottom w:w="120" w:type="dxa"/>
+              <w:end w:w="140" w:type="dxa"/>
+            </w:tcMar>
+            <w:shd w:fill="EEF3F8"/>
+          </w:tcPr>
+          <w:p>
+            <w:pPr>
+              <w:spacing w:after="0"/>
+            </w:pPr>
+            <w:r>
+              <w:rPr>
+                <w:rFonts w:ascii="Arial" w:hAnsi="Arial"/>
+                <w:sz w:val="18"/>
+              </w:rPr>
+              <w:t>Conectores</w:t>
+            </w:r>
+          </w:p>
+        </w:tc>
+        <w:tc>
+          <w:tcPr>
+            <w:tcW w:type="dxa" w:w="4536"/>
+            <w:vAlign w:val="center"/>
+            <w:tcMar>
+              <w:top w:w="120" w:type="dxa"/>
+              <w:start w:w="140" w:type="dxa"/>
+              <w:bottom w:w="120" w:type="dxa"/>
+              <w:end w:w="140" w:type="dxa"/>
+            </w:tcMar>
+            <w:shd w:fill="EEF3F8"/>
+          </w:tcPr>
+          <w:p>
+            <w:pPr>
+              <w:spacing w:after="0"/>
+            </w:pPr>
+            <w:r>
+              <w:rPr>
+                <w:rFonts w:ascii="Arial" w:hAnsi="Arial"/>
+                <w:sz w:val="18"/>
+              </w:rPr>
+              <w:t>YouTube, Instagram, Facebook, TikTok, LinkedIn y X</w:t>
+            </w:r>
+          </w:p>
+        </w:tc>
+        <w:tc>
+          <w:tcPr>
+            <w:tcW w:type="dxa" w:w="3096"/>
+            <w:vAlign w:val="center"/>
+            <w:tcMar>
+              <w:top w:w="120" w:type="dxa"/>
+              <w:start w:w="140" w:type="dxa"/>
+              <w:bottom w:w="120" w:type="dxa"/>
+              <w:end w:w="140" w:type="dxa"/>
+            </w:tcMar>
+            <w:shd w:fill="EEF3F8"/>
+          </w:tcPr>
+          <w:p>
+            <w:pPr>
+              <w:spacing w:after="0"/>
+            </w:pPr>
+            <w:r>
+              <w:rPr>
+                <w:rFonts w:ascii="Arial" w:hAnsi="Arial"/>
+                <w:sz w:val="18"/>
+              </w:rPr>
+              <w:t>Registro de proveedores y pruebas de normalizacion</w:t>
+            </w:r>
+          </w:p>
+        </w:tc>
+      </w:tr>
+      <w:tr>
+        <w:trPr>
+          <w:cantSplit/>
+        </w:trPr>
+        <w:tc>
+          <w:tcPr>
+            <w:tcW w:type="dxa" w:w="1944"/>
+            <w:vAlign w:val="center"/>
+            <w:tcMar>
+              <w:top w:w="120" w:type="dxa"/>
+              <w:start w:w="140" w:type="dxa"/>
+              <w:bottom w:w="120" w:type="dxa"/>
+              <w:end w:w="140" w:type="dxa"/>
+            </w:tcMar>
+            <w:shd w:fill="FFFFFF"/>
+          </w:tcPr>
+          <w:p>
+            <w:pPr>
+              <w:spacing w:after="0"/>
+            </w:pPr>
+            <w:r>
+              <w:rPr>
+                <w:rFonts w:ascii="Arial" w:hAnsi="Arial"/>
+                <w:sz w:val="18"/>
+              </w:rPr>
+              <w:t>Operacion</w:t>
+            </w:r>
+          </w:p>
+        </w:tc>
+        <w:tc>
+          <w:tcPr>
+            <w:tcW w:type="dxa" w:w="4536"/>
+            <w:vAlign w:val="center"/>
+            <w:tcMar>
+              <w:top w:w="120" w:type="dxa"/>
+              <w:start w:w="140" w:type="dxa"/>
+              <w:bottom w:w="120" w:type="dxa"/>
+              <w:end w:w="140" w:type="dxa"/>
+            </w:tcMar>
+            <w:shd w:fill="FFFFFF"/>
+          </w:tcPr>
+          <w:p>
+            <w:pPr>
+              <w:spacing w:after="0"/>
+            </w:pPr>
+            <w:r>
+              <w:rPr>
+                <w:rFonts w:ascii="Arial" w:hAnsi="Arial"/>
+                <w:sz w:val="18"/>
+              </w:rPr>
+              <w:t>Docker, salud y apagado ordenado</w:t>
+            </w:r>
+          </w:p>
+        </w:tc>
+        <w:tc>
+          <w:tcPr>
+            <w:tcW w:type="dxa" w:w="3096"/>
+            <w:vAlign w:val="center"/>
+            <w:tcMar>
+              <w:top w:w="120" w:type="dxa"/>
+              <w:start w:w="140" w:type="dxa"/>
+              <w:bottom w:w="120" w:type="dxa"/>
+              <w:end w:w="140" w:type="dxa"/>
+            </w:tcMar>
+            <w:shd w:fill="FFFFFF"/>
+          </w:tcPr>
+          <w:p>
+            <w:pPr>
+              <w:spacing w:after="0"/>
+            </w:pPr>
+            <w:r>
+              <w:rPr>
+                <w:rFonts w:ascii="Arial" w:hAnsi="Arial"/>
+                <w:sz w:val="18"/>
+              </w:rPr>
+              <w:t>Dockerfile, Compose y rutas de health</w:t>
+            </w:r>
+          </w:p>
+        </w:tc>
+      </w:tr>
+    </w:tbl>
+    <w:p>
+      <w:pPr>
+        <w:spacing w:after="0"/>
+      </w:pPr>
+    </w:p>
+    <w:p>
+      <w:pPr>
+        <w:pStyle w:val="Heading2"/>
+      </w:pPr>
+      <w:r>
+        <w:t>Estado de los conectores</w:t>
+      </w:r>
+    </w:p>
+    <w:p>
+      <w:r>
+        <w:t>El codigo de integracion no equivale a una conexion activa. Cada plataforma exige una aplicacion registrada, permisos aprobados, credenciales privadas y validacion con una cuenta real.</w:t>
+      </w:r>
+    </w:p>
+    <w:tbl>
+      <w:tblPr>
+        <w:tblW w:type="auto" w:w="0"/>
+        <w:jc w:val="center"/>
+        <w:tblLayout w:type="fixed"/>
+        <w:tblLook w:firstColumn="1" w:firstRow="1" w:lastColumn="0" w:lastRow="0" w:noHBand="0" w:noVBand="1" w:val="04A0"/>
+        <w:tblBorders>
+          <w:top w:val="single" w:sz="6" w:color="D9D9D9"/>
+          <w:left w:val="single" w:sz="6" w:color="D9D9D9"/>
+          <w:bottom w:val="single" w:sz="6" w:color="D9D9D9"/>
+          <w:right w:val="single" w:sz="6" w:color="D9D9D9"/>
+          <w:insideH w:val="single" w:sz="6" w:color="D9D9D9"/>
+          <w:insideV w:val="single" w:sz="6" w:color="D9D9D9"/>
+        </w:tblBorders>
+      </w:tblPr>
+      <w:tblGrid>
+        <w:gridCol w:w="3331"/>
+        <w:gridCol w:w="3331"/>
+        <w:gridCol w:w="3331"/>
+      </w:tblGrid>
+      <w:tr>
+        <w:trPr>
+          <w:tblHeader/>
+          <w:cantSplit/>
+        </w:trPr>
+        <w:tc>
+          <w:tcPr>
+            <w:tcW w:type="dxa" w:w="1800"/>
+            <w:vAlign w:val="center"/>
+            <w:tcMar>
+              <w:top w:w="120" w:type="dxa"/>
+              <w:start w:w="140" w:type="dxa"/>
+              <w:bottom w:w="120" w:type="dxa"/>
+              <w:end w:w="140" w:type="dxa"/>
+            </w:tcMar>
+            <w:shd w:fill="17324D"/>
+          </w:tcPr>
+          <w:p>
+            <w:pPr>
+              <w:spacing w:after="0"/>
+            </w:pPr>
+            <w:r>
+              <w:rPr>
+                <w:rFonts w:ascii="Arial" w:hAnsi="Arial"/>
+                <w:b/>
+                <w:color w:val="FFFFFF"/>
+                <w:sz w:val="18"/>
+              </w:rPr>
+              <w:t>Plataforma</w:t>
+            </w:r>
+          </w:p>
+        </w:tc>
+        <w:tc>
+          <w:tcPr>
+            <w:tcW w:type="dxa" w:w="3816"/>
+            <w:vAlign w:val="center"/>
+            <w:tcMar>
+              <w:top w:w="120" w:type="dxa"/>
+              <w:start w:w="140" w:type="dxa"/>
+              <w:bottom w:w="120" w:type="dxa"/>
+              <w:end w:w="140" w:type="dxa"/>
+            </w:tcMar>
+            <w:shd w:fill="17324D"/>
+          </w:tcPr>
+          <w:p>
+            <w:pPr>
+              <w:spacing w:after="0"/>
+            </w:pPr>
+            <w:r>
+              <w:rPr>
+                <w:rFonts w:ascii="Arial" w:hAnsi="Arial"/>
+                <w:b/>
+                <w:color w:val="FFFFFF"/>
+                <w:sz w:val="18"/>
+              </w:rPr>
+              <w:t>Implementacion</w:t>
+            </w:r>
+          </w:p>
+        </w:tc>
+        <w:tc>
+          <w:tcPr>
+            <w:tcW w:type="dxa" w:w="3960"/>
+            <w:vAlign w:val="center"/>
+            <w:tcMar>
+              <w:top w:w="120" w:type="dxa"/>
+              <w:start w:w="140" w:type="dxa"/>
+              <w:bottom w:w="120" w:type="dxa"/>
+              <w:end w:w="140" w:type="dxa"/>
+            </w:tcMar>
+            <w:shd w:fill="17324D"/>
+          </w:tcPr>
+          <w:p>
+            <w:pPr>
+              <w:spacing w:after="0"/>
+            </w:pPr>
+            <w:r>
+              <w:rPr>
+                <w:rFonts w:ascii="Arial" w:hAnsi="Arial"/>
+                <w:b/>
+                <w:color w:val="FFFFFF"/>
+                <w:sz w:val="18"/>
+              </w:rPr>
+              <w:t>Activacion externa</w:t>
+            </w:r>
+          </w:p>
+        </w:tc>
+      </w:tr>
+      <w:tr>
+        <w:trPr>
+          <w:cantSplit/>
+        </w:trPr>
+        <w:tc>
+          <w:tcPr>
+            <w:tcW w:type="dxa" w:w="1800"/>
+            <w:vAlign w:val="center"/>
+            <w:tcMar>
+              <w:top w:w="120" w:type="dxa"/>
+              <w:start w:w="140" w:type="dxa"/>
+              <w:bottom w:w="120" w:type="dxa"/>
+              <w:end w:w="140" w:type="dxa"/>
+            </w:tcMar>
+            <w:shd w:fill="FFFFFF"/>
+          </w:tcPr>
+          <w:p>
+            <w:pPr>
+              <w:spacing w:after="0"/>
+            </w:pPr>
+            <w:r>
+              <w:rPr>
+                <w:rFonts w:ascii="Arial" w:hAnsi="Arial"/>
+                <w:sz w:val="18"/>
+              </w:rPr>
+              <w:t>YouTube</w:t>
+            </w:r>
+          </w:p>
+        </w:tc>
+        <w:tc>
+          <w:tcPr>
+            <w:tcW w:type="dxa" w:w="3816"/>
+            <w:vAlign w:val="center"/>
+            <w:tcMar>
+              <w:top w:w="120" w:type="dxa"/>
+              <w:start w:w="140" w:type="dxa"/>
+              <w:bottom w:w="120" w:type="dxa"/>
+              <w:end w:w="140" w:type="dxa"/>
+            </w:tcMar>
+            <w:shd w:fill="FFFFFF"/>
+          </w:tcPr>
+          <w:p>
+            <w:pPr>
+              <w:spacing w:after="0"/>
+            </w:pPr>
+            <w:r>
+              <w:rPr>
+                <w:rFonts w:ascii="Arial" w:hAnsi="Arial"/>
+                <w:sz w:val="18"/>
+              </w:rPr>
+              <w:t>OAuth, renovacion y normalizacion</w:t>
+            </w:r>
+          </w:p>
+        </w:tc>
+        <w:tc>
+          <w:tcPr>
+            <w:tcW w:type="dxa" w:w="3960"/>
+            <w:vAlign w:val="center"/>
+            <w:tcMar>
+              <w:top w:w="120" w:type="dxa"/>
+              <w:start w:w="140" w:type="dxa"/>
+              <w:bottom w:w="120" w:type="dxa"/>
+              <w:end w:w="140" w:type="dxa"/>
+            </w:tcMar>
+            <w:shd w:fill="FFFFFF"/>
+          </w:tcPr>
+          <w:p>
+            <w:pPr>
+              <w:spacing w:after="0"/>
+            </w:pPr>
+            <w:r>
+              <w:rPr>
+                <w:rFonts w:ascii="Arial" w:hAnsi="Arial"/>
+                <w:sz w:val="18"/>
+              </w:rPr>
+              <w:t>Credenciales de Google</w:t>
+            </w:r>
+          </w:p>
+        </w:tc>
+      </w:tr>
+      <w:tr>
+        <w:trPr>
+          <w:cantSplit/>
+        </w:trPr>
+        <w:tc>
+          <w:tcPr>
+            <w:tcW w:type="dxa" w:w="1800"/>
+            <w:vAlign w:val="center"/>
+            <w:tcMar>
+              <w:top w:w="120" w:type="dxa"/>
+              <w:start w:w="140" w:type="dxa"/>
+              <w:bottom w:w="120" w:type="dxa"/>
+              <w:end w:w="140" w:type="dxa"/>
+            </w:tcMar>
+            <w:shd w:fill="EEF3F8"/>
+          </w:tcPr>
+          <w:p>
+            <w:pPr>
+              <w:spacing w:after="0"/>
+            </w:pPr>
+            <w:r>
+              <w:rPr>
+                <w:rFonts w:ascii="Arial" w:hAnsi="Arial"/>
+                <w:sz w:val="18"/>
+              </w:rPr>
+              <w:t>Instagram</w:t>
+            </w:r>
+          </w:p>
+        </w:tc>
+        <w:tc>
+          <w:tcPr>
+            <w:tcW w:type="dxa" w:w="3816"/>
+            <w:vAlign w:val="center"/>
+            <w:tcMar>
+              <w:top w:w="120" w:type="dxa"/>
+              <w:start w:w="140" w:type="dxa"/>
+              <w:bottom w:w="120" w:type="dxa"/>
+              <w:end w:w="140" w:type="dxa"/>
+            </w:tcMar>
+            <w:shd w:fill="EEF3F8"/>
+          </w:tcPr>
+          <w:p>
+            <w:pPr>
+              <w:spacing w:after="0"/>
+            </w:pPr>
+            <w:r>
+              <w:rPr>
+                <w:rFonts w:ascii="Arial" w:hAnsi="Arial"/>
+                <w:sz w:val="18"/>
+              </w:rPr>
+              <w:t>OAuth y perfil profesional</w:t>
+            </w:r>
+          </w:p>
+        </w:tc>
+        <w:tc>
+          <w:tcPr>
+            <w:tcW w:type="dxa" w:w="3960"/>
+            <w:vAlign w:val="center"/>
+            <w:tcMar>
+              <w:top w:w="120" w:type="dxa"/>
+              <w:start w:w="140" w:type="dxa"/>
+              <w:bottom w:w="120" w:type="dxa"/>
+              <w:end w:w="140" w:type="dxa"/>
+            </w:tcMar>
+            <w:shd w:fill="EEF3F8"/>
+          </w:tcPr>
+          <w:p>
+            <w:pPr>
+              <w:spacing w:after="0"/>
+            </w:pPr>
+            <w:r>
+              <w:rPr>
+                <w:rFonts w:ascii="Arial" w:hAnsi="Arial"/>
+                <w:sz w:val="18"/>
+              </w:rPr>
+              <w:t>App, permisos y revision de Meta</w:t>
+            </w:r>
+          </w:p>
+        </w:tc>
+      </w:tr>
+      <w:tr>
+        <w:trPr>
+          <w:cantSplit/>
+        </w:trPr>
+        <w:tc>
+          <w:tcPr>
+            <w:tcW w:type="dxa" w:w="1800"/>
+            <w:vAlign w:val="center"/>
+            <w:tcMar>
+              <w:top w:w="120" w:type="dxa"/>
+              <w:start w:w="140" w:type="dxa"/>
+              <w:bottom w:w="120" w:type="dxa"/>
+              <w:end w:w="140" w:type="dxa"/>
+            </w:tcMar>
+            <w:shd w:fill="FFFFFF"/>
+          </w:tcPr>
+          <w:p>
+            <w:pPr>
+              <w:spacing w:after="0"/>
+            </w:pPr>
+            <w:r>
+              <w:rPr>
+                <w:rFonts w:ascii="Arial" w:hAnsi="Arial"/>
+                <w:sz w:val="18"/>
+              </w:rPr>
+              <w:t>Facebook</w:t>
+            </w:r>
+          </w:p>
+        </w:tc>
+        <w:tc>
+          <w:tcPr>
+            <w:tcW w:type="dxa" w:w="3816"/>
+            <w:vAlign w:val="center"/>
+            <w:tcMar>
+              <w:top w:w="120" w:type="dxa"/>
+              <w:start w:w="140" w:type="dxa"/>
+              <w:bottom w:w="120" w:type="dxa"/>
+              <w:end w:w="140" w:type="dxa"/>
+            </w:tcMar>
+            <w:shd w:fill="FFFFFF"/>
+          </w:tcPr>
+          <w:p>
+            <w:pPr>
+              <w:spacing w:after="0"/>
+            </w:pPr>
+            <w:r>
+              <w:rPr>
+                <w:rFonts w:ascii="Arial" w:hAnsi="Arial"/>
+                <w:sz w:val="18"/>
+              </w:rPr>
+              <w:t>OAuth, paginas y publicaciones</w:t>
+            </w:r>
+          </w:p>
+        </w:tc>
+        <w:tc>
+          <w:tcPr>
+            <w:tcW w:type="dxa" w:w="3960"/>
+            <w:vAlign w:val="center"/>
+            <w:tcMar>
+              <w:top w:w="120" w:type="dxa"/>
+              <w:start w:w="140" w:type="dxa"/>
+              <w:bottom w:w="120" w:type="dxa"/>
+              <w:end w:w="140" w:type="dxa"/>
+            </w:tcMar>
+            <w:shd w:fill="FFFFFF"/>
+          </w:tcPr>
+          <w:p>
+            <w:pPr>
+              <w:spacing w:after="0"/>
+            </w:pPr>
+            <w:r>
+              <w:rPr>
+                <w:rFonts w:ascii="Arial" w:hAnsi="Arial"/>
+                <w:sz w:val="18"/>
+              </w:rPr>
+              <w:t>App, permisos y revision de Meta</w:t>
+            </w:r>
+          </w:p>
+        </w:tc>
+      </w:tr>
+      <w:tr>
+        <w:trPr>
+          <w:cantSplit/>
+        </w:trPr>
+        <w:tc>
+          <w:tcPr>
+            <w:tcW w:type="dxa" w:w="1800"/>
+            <w:vAlign w:val="center"/>
+            <w:tcMar>
+              <w:top w:w="120" w:type="dxa"/>
+              <w:start w:w="140" w:type="dxa"/>
+              <w:bottom w:w="120" w:type="dxa"/>
+              <w:end w:w="140" w:type="dxa"/>
+            </w:tcMar>
+            <w:shd w:fill="EEF3F8"/>
+          </w:tcPr>
+          <w:p>
+            <w:pPr>
+              <w:spacing w:after="0"/>
+            </w:pPr>
+            <w:r>
+              <w:rPr>
+                <w:rFonts w:ascii="Arial" w:hAnsi="Arial"/>
+                <w:sz w:val="18"/>
+              </w:rPr>
+              <w:t>TikTok</w:t>
+            </w:r>
+          </w:p>
+        </w:tc>
+        <w:tc>
+          <w:tcPr>
+            <w:tcW w:type="dxa" w:w="3816"/>
+            <w:vAlign w:val="center"/>
+            <w:tcMar>
+              <w:top w:w="120" w:type="dxa"/>
+              <w:start w:w="140" w:type="dxa"/>
+              <w:bottom w:w="120" w:type="dxa"/>
+              <w:end w:w="140" w:type="dxa"/>
+            </w:tcMar>
+            <w:shd w:fill="EEF3F8"/>
+          </w:tcPr>
+          <w:p>
+            <w:pPr>
+              <w:spacing w:after="0"/>
+            </w:pPr>
+            <w:r>
+              <w:rPr>
+                <w:rFonts w:ascii="Arial" w:hAnsi="Arial"/>
+                <w:sz w:val="18"/>
+              </w:rPr>
+              <w:t>OAuth PKCE, perfil y videos</w:t>
+            </w:r>
+          </w:p>
+        </w:tc>
+        <w:tc>
+          <w:tcPr>
+            <w:tcW w:type="dxa" w:w="3960"/>
+            <w:vAlign w:val="center"/>
+            <w:tcMar>
+              <w:top w:w="120" w:type="dxa"/>
+              <w:start w:w="140" w:type="dxa"/>
+              <w:bottom w:w="120" w:type="dxa"/>
+              <w:end w:w="140" w:type="dxa"/>
+            </w:tcMar>
+            <w:shd w:fill="EEF3F8"/>
+          </w:tcPr>
+          <w:p>
+            <w:pPr>
+              <w:spacing w:after="0"/>
+            </w:pPr>
+            <w:r>
+              <w:rPr>
+                <w:rFonts w:ascii="Arial" w:hAnsi="Arial"/>
+                <w:sz w:val="18"/>
+              </w:rPr>
+              <w:t>App y productos aprobados</w:t>
+            </w:r>
+          </w:p>
+        </w:tc>
+      </w:tr>
+      <w:tr>
+        <w:trPr>
+          <w:cantSplit/>
+        </w:trPr>
+        <w:tc>
+          <w:tcPr>
+            <w:tcW w:type="dxa" w:w="1800"/>
+            <w:vAlign w:val="center"/>
+            <w:tcMar>
+              <w:top w:w="120" w:type="dxa"/>
+              <w:start w:w="140" w:type="dxa"/>
+              <w:bottom w:w="120" w:type="dxa"/>
+              <w:end w:w="140" w:type="dxa"/>
+            </w:tcMar>
+            <w:shd w:fill="FFFFFF"/>
+          </w:tcPr>
+          <w:p>
+            <w:pPr>
+              <w:spacing w:after="0"/>
+            </w:pPr>
+            <w:r>
+              <w:rPr>
+                <w:rFonts w:ascii="Arial" w:hAnsi="Arial"/>
+                <w:sz w:val="18"/>
+              </w:rPr>
+              <w:t>LinkedIn</w:t>
+            </w:r>
+          </w:p>
+        </w:tc>
+        <w:tc>
+          <w:tcPr>
+            <w:tcW w:type="dxa" w:w="3816"/>
+            <w:vAlign w:val="center"/>
+            <w:tcMar>
+              <w:top w:w="120" w:type="dxa"/>
+              <w:start w:w="140" w:type="dxa"/>
+              <w:bottom w:w="120" w:type="dxa"/>
+              <w:end w:w="140" w:type="dxa"/>
+            </w:tcMar>
+            <w:shd w:fill="FFFFFF"/>
+          </w:tcPr>
+          <w:p>
+            <w:pPr>
+              <w:spacing w:after="0"/>
+            </w:pPr>
+            <w:r>
+              <w:rPr>
+                <w:rFonts w:ascii="Arial" w:hAnsi="Arial"/>
+                <w:sz w:val="18"/>
+              </w:rPr>
+              <w:t>OAuth, pagina y estadisticas</w:t>
+            </w:r>
+          </w:p>
+        </w:tc>
+        <w:tc>
+          <w:tcPr>
+            <w:tcW w:type="dxa" w:w="3960"/>
+            <w:vAlign w:val="center"/>
+            <w:tcMar>
+              <w:top w:w="120" w:type="dxa"/>
+              <w:start w:w="140" w:type="dxa"/>
+              <w:bottom w:w="120" w:type="dxa"/>
+              <w:end w:w="140" w:type="dxa"/>
+            </w:tcMar>
+            <w:shd w:fill="FFFFFF"/>
+          </w:tcPr>
+          <w:p>
+            <w:pPr>
+              <w:spacing w:after="0"/>
+            </w:pPr>
+            <w:r>
+              <w:rPr>
+                <w:rFonts w:ascii="Arial" w:hAnsi="Arial"/>
+                <w:sz w:val="18"/>
+              </w:rPr>
+              <w:t>Community Management API</w:t>
+            </w:r>
+          </w:p>
+        </w:tc>
+      </w:tr>
+      <w:tr>
+        <w:trPr>
+          <w:cantSplit/>
+        </w:trPr>
+        <w:tc>
+          <w:tcPr>
+            <w:tcW w:type="dxa" w:w="1800"/>
+            <w:vAlign w:val="center"/>
+            <w:tcMar>
+              <w:top w:w="120" w:type="dxa"/>
+              <w:start w:w="140" w:type="dxa"/>
+              <w:bottom w:w="120" w:type="dxa"/>
+              <w:end w:w="140" w:type="dxa"/>
+            </w:tcMar>
+            <w:shd w:fill="EEF3F8"/>
+          </w:tcPr>
+          <w:p>
+            <w:pPr>
+              <w:spacing w:after="0"/>
+            </w:pPr>
+            <w:r>
+              <w:rPr>
+                <w:rFonts w:ascii="Arial" w:hAnsi="Arial"/>
+                <w:sz w:val="18"/>
+              </w:rPr>
+              <w:t>X</w:t>
+            </w:r>
+          </w:p>
+        </w:tc>
+        <w:tc>
+          <w:tcPr>
+            <w:tcW w:type="dxa" w:w="3816"/>
+            <w:vAlign w:val="center"/>
+            <w:tcMar>
+              <w:top w:w="120" w:type="dxa"/>
+              <w:start w:w="140" w:type="dxa"/>
+              <w:bottom w:w="120" w:type="dxa"/>
+              <w:end w:w="140" w:type="dxa"/>
+            </w:tcMar>
+            <w:shd w:fill="EEF3F8"/>
+          </w:tcPr>
+          <w:p>
+            <w:pPr>
+              <w:spacing w:after="0"/>
+            </w:pPr>
+            <w:r>
+              <w:rPr>
+                <w:rFonts w:ascii="Arial" w:hAnsi="Arial"/>
+                <w:sz w:val="18"/>
+              </w:rPr>
+              <w:t>OAuth PKCE, perfil y publicaciones</w:t>
+            </w:r>
+          </w:p>
+        </w:tc>
+        <w:tc>
+          <w:tcPr>
+            <w:tcW w:type="dxa" w:w="3960"/>
+            <w:vAlign w:val="center"/>
+            <w:tcMar>
+              <w:top w:w="120" w:type="dxa"/>
+              <w:start w:w="140" w:type="dxa"/>
+              <w:bottom w:w="120" w:type="dxa"/>
+              <w:end w:w="140" w:type="dxa"/>
+            </w:tcMar>
+            <w:shd w:fill="EEF3F8"/>
+          </w:tcPr>
+          <w:p>
+            <w:pPr>
+              <w:spacing w:after="0"/>
+            </w:pPr>
+            <w:r>
+              <w:rPr>
+                <w:rFonts w:ascii="Arial" w:hAnsi="Arial"/>
+                <w:sz w:val="18"/>
+              </w:rPr>
+              <w:t>Proyecto, plan y cuotas</w:t>
+            </w:r>
+          </w:p>
+        </w:tc>
+      </w:tr>
+    </w:tbl>
+    <w:p>
+      <w:pPr>
+        <w:spacing w:after="0"/>
+      </w:pPr>
+    </w:p>
+    <w:p>
+      <w:r>
+        <w:br w:type="page"/>
+      </w:r>
+    </w:p>
+    <w:p>
+      <w:pPr>
+        <w:pStyle w:val="Heading1"/>
+      </w:pPr>
+      <w:r>
+        <w:t>Flujo de seguridad de cuenta</w:t>
+      </w:r>
+    </w:p>
+    <w:p>
+      <w:pPr>
+        <w:pStyle w:val="ListBullet"/>
+        <w:spacing w:after="80"/>
+      </w:pPr>
+      <w:r>
+        <w:t>El correo debe confirmarse antes de iniciar una sesion nueva.</w:t>
+      </w:r>
+    </w:p>
+    <w:p>
+      <w:pPr>
+        <w:pStyle w:val="ListBullet"/>
+        <w:spacing w:after="80"/>
+      </w:pPr>
+      <w:r>
+        <w:t>Los enlaces de verificacion y recuperacion expiran, se consumen una vez y se guardan como hash.</w:t>
+      </w:r>
+    </w:p>
+    <w:p>
+      <w:pPr>
+        <w:pStyle w:val="ListBullet"/>
+        <w:spacing w:after="80"/>
+      </w:pPr>
+      <w:r>
+        <w:t>El cambio de contrasena elimina sesiones anteriores.</w:t>
+      </w:r>
+    </w:p>
+    <w:p>
+      <w:pPr>
+        <w:pStyle w:val="ListBullet"/>
+        <w:spacing w:after="80"/>
+      </w:pPr>
+      <w:r>
+        <w:t>El segundo factor usa TOTP, secreto cifrado y diez codigos de recuperacion con hash.</w:t>
+      </w:r>
+    </w:p>
+    <w:p>
+      <w:pPr>
+        <w:pStyle w:val="ListBullet"/>
+        <w:spacing w:after="80"/>
+      </w:pPr>
+      <w:r>
+        <w:t>Los tokens OAuth y verificadores PKCE nunca se envian al frontend.</w:t>
+      </w:r>
+    </w:p>
+    <w:p>
+      <w:pPr>
+        <w:pStyle w:val="Heading2"/>
+      </w:pPr>
+      <w:r>
+        <w:t>Version local y version publica</w:t>
+      </w:r>
+    </w:p>
+    <w:tbl>
+      <w:tblPr>
+        <w:tblW w:type="auto" w:w="0"/>
+        <w:jc w:val="center"/>
+        <w:tblLayout w:type="fixed"/>
+        <w:tblLook w:firstColumn="1" w:firstRow="1" w:lastColumn="0" w:lastRow="0" w:noHBand="0" w:noVBand="1" w:val="04A0"/>
+        <w:tblBorders>
+          <w:top w:val="single" w:sz="6" w:color="D9D9D9"/>
+          <w:left w:val="single" w:sz="6" w:color="D9D9D9"/>
+          <w:bottom w:val="single" w:sz="6" w:color="D9D9D9"/>
+          <w:right w:val="single" w:sz="6" w:color="D9D9D9"/>
+          <w:insideH w:val="single" w:sz="6" w:color="D9D9D9"/>
+          <w:insideV w:val="single" w:sz="6" w:color="D9D9D9"/>
+        </w:tblBorders>
+      </w:tblPr>
+      <w:tblGrid>
+        <w:gridCol w:w="3331"/>
+        <w:gridCol w:w="3331"/>
+        <w:gridCol w:w="3331"/>
+      </w:tblGrid>
+      <w:tr>
+        <w:trPr>
+          <w:tblHeader/>
+          <w:cantSplit/>
+        </w:trPr>
+        <w:tc>
+          <w:tcPr>
+            <w:tcW w:type="dxa" w:w="3456"/>
+            <w:vAlign w:val="center"/>
+            <w:tcMar>
+              <w:top w:w="120" w:type="dxa"/>
+              <w:start w:w="140" w:type="dxa"/>
+              <w:bottom w:w="120" w:type="dxa"/>
+              <w:end w:w="140" w:type="dxa"/>
+            </w:tcMar>
+            <w:shd w:fill="17324D"/>
+          </w:tcPr>
+          <w:p>
+            <w:pPr>
+              <w:spacing w:after="0"/>
+            </w:pPr>
+            <w:r>
+              <w:rPr>
+                <w:rFonts w:ascii="Arial" w:hAnsi="Arial"/>
+                <w:b/>
+                <w:color w:val="FFFFFF"/>
+                <w:sz w:val="18"/>
+              </w:rPr>
+              <w:t>Caracteristica</w:t>
+            </w:r>
+          </w:p>
+        </w:tc>
+        <w:tc>
+          <w:tcPr>
+            <w:tcW w:type="dxa" w:w="3024"/>
+            <w:vAlign w:val="center"/>
+            <w:tcMar>
+              <w:top w:w="120" w:type="dxa"/>
+              <w:start w:w="140" w:type="dxa"/>
+              <w:bottom w:w="120" w:type="dxa"/>
+              <w:end w:w="140" w:type="dxa"/>
+            </w:tcMar>
+            <w:shd w:fill="17324D"/>
+          </w:tcPr>
+          <w:p>
+            <w:pPr>
+              <w:spacing w:after="0"/>
+            </w:pPr>
+            <w:r>
+              <w:rPr>
+                <w:rFonts w:ascii="Arial" w:hAnsi="Arial"/>
+                <w:b/>
+                <w:color w:val="FFFFFF"/>
+                <w:sz w:val="18"/>
+              </w:rPr>
+              <w:t>Local</w:t>
+            </w:r>
+          </w:p>
+        </w:tc>
+        <w:tc>
+          <w:tcPr>
+            <w:tcW w:type="dxa" w:w="3096"/>
+            <w:vAlign w:val="center"/>
+            <w:tcMar>
+              <w:top w:w="120" w:type="dxa"/>
+              <w:start w:w="140" w:type="dxa"/>
+              <w:bottom w:w="120" w:type="dxa"/>
+              <w:end w:w="140" w:type="dxa"/>
+            </w:tcMar>
+            <w:shd w:fill="17324D"/>
+          </w:tcPr>
+          <w:p>
+            <w:pPr>
+              <w:spacing w:after="0"/>
+            </w:pPr>
+            <w:r>
+              <w:rPr>
+                <w:rFonts w:ascii="Arial" w:hAnsi="Arial"/>
+                <w:b/>
+                <w:color w:val="FFFFFF"/>
+                <w:sz w:val="18"/>
+              </w:rPr>
+              <w:t>Publica</w:t>
+            </w:r>
+          </w:p>
+        </w:tc>
+      </w:tr>
+      <w:tr>
+        <w:trPr>
+          <w:cantSplit/>
+        </w:trPr>
+        <w:tc>
+          <w:tcPr>
+            <w:tcW w:type="dxa" w:w="3456"/>
+            <w:vAlign w:val="center"/>
+            <w:tcMar>
+              <w:top w:w="120" w:type="dxa"/>
+              <w:start w:w="140" w:type="dxa"/>
+              <w:bottom w:w="120" w:type="dxa"/>
+              <w:end w:w="140" w:type="dxa"/>
+            </w:tcMar>
+            <w:shd w:fill="FFFFFF"/>
+          </w:tcPr>
+          <w:p>
+            <w:pPr>
+              <w:spacing w:after="0"/>
+            </w:pPr>
+            <w:r>
+              <w:rPr>
+                <w:rFonts w:ascii="Arial" w:hAnsi="Arial"/>
+                <w:sz w:val="18"/>
+              </w:rPr>
+              <w:t>Backend y API</w:t>
+            </w:r>
+          </w:p>
+        </w:tc>
+        <w:tc>
+          <w:tcPr>
+            <w:tcW w:type="dxa" w:w="3024"/>
+            <w:vAlign w:val="center"/>
+            <w:tcMar>
+              <w:top w:w="120" w:type="dxa"/>
+              <w:start w:w="140" w:type="dxa"/>
+              <w:bottom w:w="120" w:type="dxa"/>
+              <w:end w:w="140" w:type="dxa"/>
+            </w:tcMar>
+            <w:shd w:fill="FFFFFF"/>
+          </w:tcPr>
+          <w:p>
+            <w:pPr>
+              <w:spacing w:after="0"/>
+            </w:pPr>
+            <w:r>
+              <w:rPr>
+                <w:rFonts w:ascii="Arial" w:hAnsi="Arial"/>
+                <w:sz w:val="18"/>
+              </w:rPr>
+              <w:t>Si</w:t>
+            </w:r>
+          </w:p>
+        </w:tc>
+        <w:tc>
+          <w:tcPr>
+            <w:tcW w:type="dxa" w:w="3096"/>
+            <w:vAlign w:val="center"/>
+            <w:tcMar>
+              <w:top w:w="120" w:type="dxa"/>
+              <w:start w:w="140" w:type="dxa"/>
+              <w:bottom w:w="120" w:type="dxa"/>
+              <w:end w:w="140" w:type="dxa"/>
+            </w:tcMar>
+            <w:shd w:fill="FFFFFF"/>
+          </w:tcPr>
+          <w:p>
+            <w:pPr>
+              <w:spacing w:after="0"/>
+            </w:pPr>
+            <w:r>
+              <w:rPr>
+                <w:rFonts w:ascii="Arial" w:hAnsi="Arial"/>
+                <w:sz w:val="18"/>
+              </w:rPr>
+              <w:t>No</w:t>
+            </w:r>
+          </w:p>
+        </w:tc>
+      </w:tr>
+      <w:tr>
+        <w:trPr>
+          <w:cantSplit/>
+        </w:trPr>
+        <w:tc>
+          <w:tcPr>
+            <w:tcW w:type="dxa" w:w="3456"/>
+            <w:vAlign w:val="center"/>
+            <w:tcMar>
+              <w:top w:w="120" w:type="dxa"/>
+              <w:start w:w="140" w:type="dxa"/>
+              <w:bottom w:w="120" w:type="dxa"/>
+              <w:end w:w="140" w:type="dxa"/>
+            </w:tcMar>
+            <w:shd w:fill="EEF3F8"/>
+          </w:tcPr>
+          <w:p>
+            <w:pPr>
+              <w:spacing w:after="0"/>
+            </w:pPr>
+            <w:r>
+              <w:rPr>
+                <w:rFonts w:ascii="Arial" w:hAnsi="Arial"/>
+                <w:sz w:val="18"/>
+              </w:rPr>
+              <w:t>Base de datos</w:t>
+            </w:r>
+          </w:p>
+        </w:tc>
+        <w:tc>
+          <w:tcPr>
+            <w:tcW w:type="dxa" w:w="3024"/>
+            <w:vAlign w:val="center"/>
+            <w:tcMar>
+              <w:top w:w="120" w:type="dxa"/>
+              <w:start w:w="140" w:type="dxa"/>
+              <w:bottom w:w="120" w:type="dxa"/>
+              <w:end w:w="140" w:type="dxa"/>
+            </w:tcMar>
+            <w:shd w:fill="EEF3F8"/>
+          </w:tcPr>
+          <w:p>
+            <w:pPr>
+              <w:spacing w:after="0"/>
+            </w:pPr>
+            <w:r>
+              <w:rPr>
+                <w:rFonts w:ascii="Arial" w:hAnsi="Arial"/>
+                <w:sz w:val="18"/>
+              </w:rPr>
+              <w:t>SQLite persistente</w:t>
+            </w:r>
+          </w:p>
+        </w:tc>
+        <w:tc>
+          <w:tcPr>
+            <w:tcW w:type="dxa" w:w="3096"/>
+            <w:vAlign w:val="center"/>
+            <w:tcMar>
+              <w:top w:w="120" w:type="dxa"/>
+              <w:start w:w="140" w:type="dxa"/>
+              <w:bottom w:w="120" w:type="dxa"/>
+              <w:end w:w="140" w:type="dxa"/>
+            </w:tcMar>
+            <w:shd w:fill="EEF3F8"/>
+          </w:tcPr>
+          <w:p>
+            <w:pPr>
+              <w:spacing w:after="0"/>
+            </w:pPr>
+            <w:r>
+              <w:rPr>
+                <w:rFonts w:ascii="Arial" w:hAnsi="Arial"/>
+                <w:sz w:val="18"/>
+              </w:rPr>
+              <w:t>No almacena datos</w:t>
+            </w:r>
+          </w:p>
+        </w:tc>
+      </w:tr>
+      <w:tr>
+        <w:trPr>
+          <w:cantSplit/>
+        </w:trPr>
+        <w:tc>
+          <w:tcPr>
+            <w:tcW w:type="dxa" w:w="3456"/>
+            <w:vAlign w:val="center"/>
+            <w:tcMar>
+              <w:top w:w="120" w:type="dxa"/>
+              <w:start w:w="140" w:type="dxa"/>
+              <w:bottom w:w="120" w:type="dxa"/>
+              <w:end w:w="140" w:type="dxa"/>
+            </w:tcMar>
+            <w:shd w:fill="FFFFFF"/>
+          </w:tcPr>
+          <w:p>
+            <w:pPr>
+              <w:spacing w:after="0"/>
+            </w:pPr>
+            <w:r>
+              <w:rPr>
+                <w:rFonts w:ascii="Arial" w:hAnsi="Arial"/>
+                <w:sz w:val="18"/>
+              </w:rPr>
+              <w:t>Usuarios y MFA</w:t>
+            </w:r>
+          </w:p>
+        </w:tc>
+        <w:tc>
+          <w:tcPr>
+            <w:tcW w:type="dxa" w:w="3024"/>
+            <w:vAlign w:val="center"/>
+            <w:tcMar>
+              <w:top w:w="120" w:type="dxa"/>
+              <w:start w:w="140" w:type="dxa"/>
+              <w:bottom w:w="120" w:type="dxa"/>
+              <w:end w:w="140" w:type="dxa"/>
+            </w:tcMar>
+            <w:shd w:fill="FFFFFF"/>
+          </w:tcPr>
+          <w:p>
+            <w:pPr>
+              <w:spacing w:after="0"/>
+            </w:pPr>
+            <w:r>
+              <w:rPr>
+                <w:rFonts w:ascii="Arial" w:hAnsi="Arial"/>
+                <w:sz w:val="18"/>
+              </w:rPr>
+              <w:t>Funcionales</w:t>
+            </w:r>
+          </w:p>
+        </w:tc>
+        <w:tc>
+          <w:tcPr>
+            <w:tcW w:type="dxa" w:w="3096"/>
+            <w:vAlign w:val="center"/>
+            <w:tcMar>
+              <w:top w:w="120" w:type="dxa"/>
+              <w:start w:w="140" w:type="dxa"/>
+              <w:bottom w:w="120" w:type="dxa"/>
+              <w:end w:w="140" w:type="dxa"/>
+            </w:tcMar>
+            <w:shd w:fill="FFFFFF"/>
+          </w:tcPr>
+          <w:p>
+            <w:pPr>
+              <w:spacing w:after="0"/>
+            </w:pPr>
+            <w:r>
+              <w:rPr>
+                <w:rFonts w:ascii="Arial" w:hAnsi="Arial"/>
+                <w:sz w:val="18"/>
+              </w:rPr>
+              <w:t>Solo presentacion visual</w:t>
+            </w:r>
+          </w:p>
+        </w:tc>
+      </w:tr>
+      <w:tr>
+        <w:trPr>
+          <w:cantSplit/>
+        </w:trPr>
+        <w:tc>
+          <w:tcPr>
+            <w:tcW w:type="dxa" w:w="3456"/>
+            <w:vAlign w:val="center"/>
+            <w:tcMar>
+              <w:top w:w="120" w:type="dxa"/>
+              <w:start w:w="140" w:type="dxa"/>
+              <w:bottom w:w="120" w:type="dxa"/>
+              <w:end w:w="140" w:type="dxa"/>
+            </w:tcMar>
+            <w:shd w:fill="EEF3F8"/>
+          </w:tcPr>
+          <w:p>
+            <w:pPr>
+              <w:spacing w:after="0"/>
+            </w:pPr>
+            <w:r>
+              <w:rPr>
+                <w:rFonts w:ascii="Arial" w:hAnsi="Arial"/>
+                <w:sz w:val="18"/>
+              </w:rPr>
+              <w:t>OAuth y sincronizacion</w:t>
+            </w:r>
+          </w:p>
+        </w:tc>
+        <w:tc>
+          <w:tcPr>
+            <w:tcW w:type="dxa" w:w="3024"/>
+            <w:vAlign w:val="center"/>
+            <w:tcMar>
+              <w:top w:w="120" w:type="dxa"/>
+              <w:start w:w="140" w:type="dxa"/>
+              <w:bottom w:w="120" w:type="dxa"/>
+              <w:end w:w="140" w:type="dxa"/>
+            </w:tcMar>
+            <w:shd w:fill="EEF3F8"/>
+          </w:tcPr>
+          <w:p>
+            <w:pPr>
+              <w:spacing w:after="0"/>
+            </w:pPr>
+            <w:r>
+              <w:rPr>
+                <w:rFonts w:ascii="Arial" w:hAnsi="Arial"/>
+                <w:sz w:val="18"/>
+              </w:rPr>
+              <w:t>Disponibles con credenciales</w:t>
+            </w:r>
+          </w:p>
+        </w:tc>
+        <w:tc>
+          <w:tcPr>
+            <w:tcW w:type="dxa" w:w="3096"/>
+            <w:vAlign w:val="center"/>
+            <w:tcMar>
+              <w:top w:w="120" w:type="dxa"/>
+              <w:start w:w="140" w:type="dxa"/>
+              <w:bottom w:w="120" w:type="dxa"/>
+              <w:end w:w="140" w:type="dxa"/>
+            </w:tcMar>
+            <w:shd w:fill="EEF3F8"/>
+          </w:tcPr>
+          <w:p>
+            <w:pPr>
+              <w:spacing w:after="0"/>
+            </w:pPr>
+            <w:r>
+              <w:rPr>
+                <w:rFonts w:ascii="Arial" w:hAnsi="Arial"/>
+                <w:sz w:val="18"/>
+              </w:rPr>
+              <w:t>Deshabilitados</w:t>
+            </w:r>
+          </w:p>
+        </w:tc>
+      </w:tr>
+      <w:tr>
+        <w:trPr>
+          <w:cantSplit/>
+        </w:trPr>
+        <w:tc>
+          <w:tcPr>
+            <w:tcW w:type="dxa" w:w="3456"/>
+            <w:vAlign w:val="center"/>
+            <w:tcMar>
+              <w:top w:w="120" w:type="dxa"/>
+              <w:start w:w="140" w:type="dxa"/>
+              <w:bottom w:w="120" w:type="dxa"/>
+              <w:end w:w="140" w:type="dxa"/>
+            </w:tcMar>
+            <w:shd w:fill="FFFFFF"/>
+          </w:tcPr>
+          <w:p>
+            <w:pPr>
+              <w:spacing w:after="0"/>
+            </w:pPr>
+            <w:r>
+              <w:rPr>
+                <w:rFonts w:ascii="Arial" w:hAnsi="Arial"/>
+                <w:sz w:val="18"/>
+              </w:rPr>
+              <w:t>Actualizacion</w:t>
+            </w:r>
+          </w:p>
+        </w:tc>
+        <w:tc>
+          <w:tcPr>
+            <w:tcW w:type="dxa" w:w="3024"/>
+            <w:vAlign w:val="center"/>
+            <w:tcMar>
+              <w:top w:w="120" w:type="dxa"/>
+              <w:start w:w="140" w:type="dxa"/>
+              <w:bottom w:w="120" w:type="dxa"/>
+              <w:end w:w="140" w:type="dxa"/>
+            </w:tcMar>
+            <w:shd w:fill="FFFFFF"/>
+          </w:tcPr>
+          <w:p>
+            <w:pPr>
+              <w:spacing w:after="0"/>
+            </w:pPr>
+            <w:r>
+              <w:rPr>
+                <w:rFonts w:ascii="Arial" w:hAnsi="Arial"/>
+                <w:sz w:val="18"/>
+              </w:rPr>
+              <w:t>Al ejecutar el codigo local</w:t>
+            </w:r>
+          </w:p>
+        </w:tc>
+        <w:tc>
+          <w:tcPr>
+            <w:tcW w:type="dxa" w:w="3096"/>
+            <w:vAlign w:val="center"/>
+            <w:tcMar>
+              <w:top w:w="120" w:type="dxa"/>
+              <w:start w:w="140" w:type="dxa"/>
+              <w:bottom w:w="120" w:type="dxa"/>
+              <w:end w:w="140" w:type="dxa"/>
+            </w:tcMar>
+            <w:shd w:fill="FFFFFF"/>
+          </w:tcPr>
+          <w:p>
+            <w:pPr>
+              <w:spacing w:after="0"/>
+            </w:pPr>
+            <w:r>
+              <w:rPr>
+                <w:rFonts w:ascii="Arial" w:hAnsi="Arial"/>
+                <w:sz w:val="18"/>
+              </w:rPr>
+              <w:t>Tras enviar a main y completar GitHub Actions</w:t>
+            </w:r>
+          </w:p>
+        </w:tc>
+      </w:tr>
+    </w:tbl>
+    <w:p>
+      <w:pPr>
+        <w:spacing w:after="0"/>
+      </w:pPr>
+    </w:p>
+    <w:p>
+      <w:pPr>
+        <w:pStyle w:val="Heading2"/>
+      </w:pPr>
+      <w:r>
+        <w:t>Produccion y alta disponibilidad</w:t>
+      </w:r>
+    </w:p>
+    <w:p>
+      <w:r>
+        <w:t>La aplicacion esta preparada para empaquetarse como una instancia, pero no se considera desplegada en produccion. SQLite impide operar multiples servidores de forma segura. La siguiente fase debe incorporar PostgreSQL administrado, una cola compartida, balanceo, copias, observabilidad y pruebas de recuperacion.</w:t>
+      </w:r>
+    </w:p>
+    <w:p>
+      <w:pPr>
+        <w:pStyle w:val="Heading2"/>
+      </w:pPr>
+      <w:r>
+        <w:t>Validacion de esta version</w:t>
+      </w:r>
+    </w:p>
+    <w:p>
+      <w:pPr>
+        <w:pStyle w:val="ListBullet"/>
+        <w:spacing w:after="80"/>
+      </w:pPr>
+      <w:r>
+        <w:t>25 pruebas automatizadas aprobadas.</w:t>
+      </w:r>
+    </w:p>
+    <w:p>
+      <w:pPr>
+        <w:pStyle w:val="ListBullet"/>
+        <w:spacing w:after="80"/>
+      </w:pPr>
+      <w:r>
+        <w:t>Compilacion estatica completada.</w:t>
+      </w:r>
+    </w:p>
+    <w:p>
+      <w:pPr>
+        <w:pStyle w:val="ListBullet"/>
+        <w:spacing w:after="80"/>
+      </w:pPr>
+      <w:r>
+        <w:t>Cuenta y MFA revisados en escritorio y movil.</w:t>
+      </w:r>
+    </w:p>
+    <w:p>
+      <w:pPr>
+        <w:pStyle w:val="ListBullet"/>
+        <w:spacing w:after="80"/>
+      </w:pPr>
+      <w:r>
+        <w:t>No se incorporaron credenciales reales ni datos privados.</w:t>
+      </w:r>
+    </w:p>
+    <w:p>
+      <w:pPr>
+        <w:pStyle w:val="ListBullet"/>
+        <w:spacing w:after="80"/>
+      </w:pPr>
+      <w:r>
+        <w:t>Docker no estaba instalado en el equipo, por lo que el contenedor no se ejecuto localmente.</w:t>
+      </w:r>
+    </w:p>
     <w:sectPr>
       <w:footerReference w:type="default" r:id="rId9"/>
       <w:pgSz w:w="12240" w:h="15840"/>
-      <w:pgMar w:top="1020" w:right="1077" w:bottom="964" w:left="1077" w:header="720" w:footer="720" w:gutter="0"/>
+      <w:pgMar w:top="1037" w:right="1123" w:bottom="1008" w:left="1123" w:header="720" w:footer="720" w:gutter="0"/>
       <w:cols w:space="720"/>
       <w:docGrid w:linePitch="360"/>
     </w:sectPr>
@@ -9768,20 +11253,10 @@
     <w:r>
       <w:rPr>
         <w:rFonts w:ascii="Arial" w:hAnsi="Arial"/>
-        <w:color w:val="667085"/>
+        <w:color w:val="5C6670"/>
         <w:sz w:val="16"/>
       </w:rPr>
-      <w:t xml:space="preserve">Social Audit Pro  |  Manual de avance  |  </w:t>
-    </w:r>
-    <w:r>
-      <w:rPr>
-        <w:rFonts w:ascii="Arial" w:hAnsi="Arial"/>
-        <w:color w:val="667085"/>
-        <w:sz w:val="16"/>
-      </w:rPr>
-      <w:fldChar w:fldCharType="begin"/>
-      <w:instrText xml:space="preserve">PAGE</w:instrText>
-      <w:fldChar w:fldCharType="end"/>
+      <w:t>Social Audit Pro  |  Documentacion del proyecto</w:t>
     </w:r>
   </w:p>
 </w:ftr>
@@ -10151,12 +11626,12 @@
     <w:qFormat/>
     <w:rsid w:val="00FC693F"/>
     <w:pPr>
-      <w:spacing w:line="269" w:lineRule="auto" w:after="120"/>
+      <w:spacing w:line="269" w:lineRule="auto" w:after="140"/>
     </w:pPr>
     <w:rPr>
       <w:rFonts w:ascii="Arial" w:hAnsi="Arial"/>
-      <w:color w:val="344054"/>
-      <w:sz w:val="19"/>
+      <w:color w:val="232A30"/>
+      <w:sz w:val="21"/>
     </w:rPr>
   </w:style>
   <w:style w:type="paragraph" w:styleId="Header">
@@ -10214,7 +11689,7 @@
     <w:pPr>
       <w:keepNext/>
       <w:keepLines/>
-      <w:spacing w:before="240" w:after="120"/>
+      <w:spacing w:before="280" w:after="140"/>
       <w:outlineLvl w:val="0"/>
     </w:pPr>
     <w:rPr>
@@ -10222,7 +11697,7 @@
       <w:b/>
       <w:bCs/>
       <w:color w:val="000000"/>
-      <w:sz w:val="38"/>
+      <w:sz w:val="36"/>
       <w:szCs w:val="28"/>
     </w:rPr>
   </w:style>
@@ -10238,7 +11713,7 @@
     <w:pPr>
       <w:keepNext/>
       <w:keepLines/>
-      <w:spacing w:before="160" w:after="120"/>
+      <w:spacing w:before="280" w:after="140"/>
       <w:outlineLvl w:val="1"/>
     </w:pPr>
     <w:rPr>
@@ -10501,7 +11976,7 @@
     <w:qFormat/>
     <w:rsid w:val="00FC693F"/>
     <w:pPr>
-      <w:spacing w:after="300" w:line="240" w:lineRule="auto"/>
+      <w:spacing w:after="140" w:line="240" w:lineRule="auto" w:before="0"/>
       <w:contextualSpacing/>
     </w:pPr>
     <w:rPr>
@@ -10510,7 +11985,7 @@
       <w:color w:val="000000"/>
       <w:spacing w:val="5"/>
       <w:kern w:val="28"/>
-      <w:sz w:val="62"/>
+      <w:sz w:val="56"/>
       <w:szCs w:val="52"/>
     </w:rPr>
   </w:style>
@@ -10686,6 +12161,10 @@
       </w:numPr>
       <w:contextualSpacing/>
     </w:pPr>
+    <w:rPr>
+      <w:rFonts w:ascii="Arial" w:hAnsi="Arial"/>
+      <w:sz w:val="21"/>
+    </w:rPr>
   </w:style>
   <w:style w:type="paragraph" w:styleId="ListBullet2">
     <w:name w:val="List Bullet 2"/>

</xml_diff>

<commit_message>
feat: agrega copias cifradas y restauracion verificada
</commit_message>
<xml_diff>
--- a/docs/manuales/Manual-de-avance-Social-Audit-Pro.docx
+++ b/docs/manuales/Manual-de-avance-Social-Audit-Pro.docx
@@ -164,12 +164,8 @@
             <w:vAlign w:val="center"/>
           </w:tcPr>
           <w:p>
-            <w:pPr>
-              <w:spacing w:after="0"/>
-              <w:jc w:val="center"/>
-            </w:pPr>
-            <w:r>
-              <w:t>v0.5.0</w:t>
+            <w:r>
+              <w:t>v0.5.1</w:t>
             </w:r>
           </w:p>
         </w:tc>
@@ -256,12 +252,8 @@
             <w:vAlign w:val="center"/>
           </w:tcPr>
           <w:p>
-            <w:pPr>
-              <w:spacing w:after="0"/>
-              <w:jc w:val="center"/>
-            </w:pPr>
-            <w:r>
-              <w:t>avance-011</w:t>
+            <w:r>
+              <w:t>avance-012</w:t>
             </w:r>
           </w:p>
         </w:tc>
@@ -11230,6 +11222,883 @@
       </w:pPr>
       <w:r>
         <w:t>Docker no estaba instalado en el equipo, por lo que el contenedor no se ejecuto localmente.</w:t>
+      </w:r>
+    </w:p>
+    <w:p>
+      <w:r>
+        <w:br w:type="page"/>
+      </w:r>
+    </w:p>
+    <w:p>
+      <w:pPr>
+        <w:pStyle w:val="Heading1"/>
+      </w:pPr>
+      <w:r>
+        <w:t>Copias cifradas y recuperacion controlada</w:t>
+      </w:r>
+    </w:p>
+    <w:p>
+      <w:r>
+        <w:t>Avance 012 de la version v0.5.1. El sistema puede crear copias cifradas de SQLite y recuperarlas a un archivo nuevo sin sobrescribir la base activa. El recorrido se probo con datos desechables. Las copias periodicas siguen desactivadas hasta configurar una clave propia; no se cambiaron la base ni los secretos del usuario.</w:t>
+      </w:r>
+    </w:p>
+    <w:p>
+      <w:pPr>
+        <w:pStyle w:val="Heading2"/>
+      </w:pPr>
+      <w:r>
+        <w:t>Que incorpora este avance</w:t>
+      </w:r>
+    </w:p>
+    <w:tbl>
+      <w:tblPr>
+        <w:tblW w:type="auto" w:w="0"/>
+        <w:jc w:val="center"/>
+        <w:tblLayout w:type="fixed"/>
+        <w:tblLook w:firstColumn="1" w:firstRow="1" w:lastColumn="0" w:lastRow="0" w:noHBand="0" w:noVBand="1" w:val="04A0"/>
+        <w:tblBorders>
+          <w:top w:val="single" w:sz="6" w:color="D9D9D9"/>
+          <w:left w:val="single" w:sz="6" w:color="D9D9D9"/>
+          <w:bottom w:val="single" w:sz="6" w:color="D9D9D9"/>
+          <w:right w:val="single" w:sz="6" w:color="D9D9D9"/>
+          <w:insideH w:val="single" w:sz="6" w:color="D9D9D9"/>
+          <w:insideV w:val="single" w:sz="6" w:color="D9D9D9"/>
+        </w:tblBorders>
+      </w:tblPr>
+      <w:tblGrid>
+        <w:gridCol w:w="2232"/>
+        <w:gridCol w:w="7560"/>
+      </w:tblGrid>
+      <w:tr>
+        <w:trPr>
+          <w:tblHeader/>
+          <w:cantSplit/>
+        </w:trPr>
+        <w:tc>
+          <w:tcPr>
+            <w:tcW w:type="dxa" w:w="2232"/>
+            <w:vAlign w:val="center"/>
+            <w:tcMar>
+              <w:top w:w="120" w:type="dxa"/>
+              <w:start w:w="140" w:type="dxa"/>
+              <w:bottom w:w="120" w:type="dxa"/>
+              <w:end w:w="140" w:type="dxa"/>
+            </w:tcMar>
+            <w:shd w:fill="17324D"/>
+          </w:tcPr>
+          <w:p>
+            <w:pPr>
+              <w:spacing w:after="0"/>
+            </w:pPr>
+            <w:r>
+              <w:rPr>
+                <w:rFonts w:ascii="Arial" w:hAnsi="Arial"/>
+                <w:b/>
+                <w:color w:val="FFFFFF"/>
+                <w:sz w:val="18"/>
+              </w:rPr>
+              <w:t>Funcion</w:t>
+            </w:r>
+          </w:p>
+        </w:tc>
+        <w:tc>
+          <w:tcPr>
+            <w:tcW w:type="dxa" w:w="7560"/>
+            <w:vAlign w:val="center"/>
+            <w:tcMar>
+              <w:top w:w="120" w:type="dxa"/>
+              <w:start w:w="140" w:type="dxa"/>
+              <w:bottom w:w="120" w:type="dxa"/>
+              <w:end w:w="140" w:type="dxa"/>
+            </w:tcMar>
+            <w:shd w:fill="17324D"/>
+          </w:tcPr>
+          <w:p>
+            <w:pPr>
+              <w:spacing w:after="0"/>
+            </w:pPr>
+            <w:r>
+              <w:rPr>
+                <w:rFonts w:ascii="Arial" w:hAnsi="Arial"/>
+                <w:b/>
+                <w:color w:val="FFFFFF"/>
+                <w:sz w:val="18"/>
+              </w:rPr>
+              <w:t>Comportamiento</w:t>
+            </w:r>
+          </w:p>
+        </w:tc>
+      </w:tr>
+      <w:tr>
+        <w:trPr>
+          <w:cantSplit/>
+        </w:trPr>
+        <w:tc>
+          <w:tcPr>
+            <w:tcW w:type="dxa" w:w="2232"/>
+            <w:vAlign w:val="center"/>
+            <w:tcMar>
+              <w:top w:w="120" w:type="dxa"/>
+              <w:start w:w="140" w:type="dxa"/>
+              <w:bottom w:w="120" w:type="dxa"/>
+              <w:end w:w="140" w:type="dxa"/>
+            </w:tcMar>
+            <w:shd w:fill="FFFFFF"/>
+          </w:tcPr>
+          <w:p>
+            <w:pPr>
+              <w:spacing w:after="0"/>
+            </w:pPr>
+            <w:r>
+              <w:rPr>
+                <w:rFonts w:ascii="Arial" w:hAnsi="Arial"/>
+                <w:sz w:val="18"/>
+              </w:rPr>
+              <w:t>Copia online</w:t>
+            </w:r>
+          </w:p>
+        </w:tc>
+        <w:tc>
+          <w:tcPr>
+            <w:tcW w:type="dxa" w:w="7560"/>
+            <w:vAlign w:val="center"/>
+            <w:tcMar>
+              <w:top w:w="120" w:type="dxa"/>
+              <w:start w:w="140" w:type="dxa"/>
+              <w:bottom w:w="120" w:type="dxa"/>
+              <w:end w:w="140" w:type="dxa"/>
+            </w:tcMar>
+            <w:shd w:fill="FFFFFF"/>
+          </w:tcPr>
+          <w:p>
+            <w:pPr>
+              <w:spacing w:after="0"/>
+            </w:pPr>
+            <w:r>
+              <w:rPr>
+                <w:rFonts w:ascii="Arial" w:hAnsi="Arial"/>
+                <w:sz w:val="18"/>
+              </w:rPr>
+              <w:t>Incluye escrituras confirmadas en WAL usando la API de backup de SQLite.</w:t>
+            </w:r>
+          </w:p>
+        </w:tc>
+      </w:tr>
+      <w:tr>
+        <w:trPr>
+          <w:cantSplit/>
+        </w:trPr>
+        <w:tc>
+          <w:tcPr>
+            <w:tcW w:type="dxa" w:w="2232"/>
+            <w:vAlign w:val="center"/>
+            <w:tcMar>
+              <w:top w:w="120" w:type="dxa"/>
+              <w:start w:w="140" w:type="dxa"/>
+              <w:bottom w:w="120" w:type="dxa"/>
+              <w:end w:w="140" w:type="dxa"/>
+            </w:tcMar>
+            <w:shd w:fill="EEF3F8"/>
+          </w:tcPr>
+          <w:p>
+            <w:pPr>
+              <w:spacing w:after="0"/>
+            </w:pPr>
+            <w:r>
+              <w:rPr>
+                <w:rFonts w:ascii="Arial" w:hAnsi="Arial"/>
+                <w:sz w:val="18"/>
+              </w:rPr>
+              <w:t>Cifrado</w:t>
+            </w:r>
+          </w:p>
+        </w:tc>
+        <w:tc>
+          <w:tcPr>
+            <w:tcW w:type="dxa" w:w="7560"/>
+            <w:vAlign w:val="center"/>
+            <w:tcMar>
+              <w:top w:w="120" w:type="dxa"/>
+              <w:start w:w="140" w:type="dxa"/>
+              <w:bottom w:w="120" w:type="dxa"/>
+              <w:end w:w="140" w:type="dxa"/>
+            </w:tcMar>
+            <w:shd w:fill="EEF3F8"/>
+          </w:tcPr>
+          <w:p>
+            <w:pPr>
+              <w:spacing w:after="0"/>
+            </w:pPr>
+            <w:r>
+              <w:rPr>
+                <w:rFonts w:ascii="Arial" w:hAnsi="Arial"/>
+                <w:sz w:val="18"/>
+              </w:rPr>
+              <w:t>AES 256 GCM con clave independiente y metadatos autenticados.</w:t>
+            </w:r>
+          </w:p>
+        </w:tc>
+      </w:tr>
+      <w:tr>
+        <w:trPr>
+          <w:cantSplit/>
+        </w:trPr>
+        <w:tc>
+          <w:tcPr>
+            <w:tcW w:type="dxa" w:w="2232"/>
+            <w:vAlign w:val="center"/>
+            <w:tcMar>
+              <w:top w:w="120" w:type="dxa"/>
+              <w:start w:w="140" w:type="dxa"/>
+              <w:bottom w:w="120" w:type="dxa"/>
+              <w:end w:w="140" w:type="dxa"/>
+            </w:tcMar>
+            <w:shd w:fill="FFFFFF"/>
+          </w:tcPr>
+          <w:p>
+            <w:pPr>
+              <w:spacing w:after="0"/>
+            </w:pPr>
+            <w:r>
+              <w:rPr>
+                <w:rFonts w:ascii="Arial" w:hAnsi="Arial"/>
+                <w:sz w:val="18"/>
+              </w:rPr>
+              <w:t>Verificacion</w:t>
+            </w:r>
+          </w:p>
+        </w:tc>
+        <w:tc>
+          <w:tcPr>
+            <w:tcW w:type="dxa" w:w="7560"/>
+            <w:vAlign w:val="center"/>
+            <w:tcMar>
+              <w:top w:w="120" w:type="dxa"/>
+              <w:start w:w="140" w:type="dxa"/>
+              <w:bottom w:w="120" w:type="dxa"/>
+              <w:end w:w="140" w:type="dxa"/>
+            </w:tcMar>
+            <w:shd w:fill="FFFFFF"/>
+          </w:tcPr>
+          <w:p>
+            <w:pPr>
+              <w:spacing w:after="0"/>
+            </w:pPr>
+            <w:r>
+              <w:rPr>
+                <w:rFonts w:ascii="Arial" w:hAnsi="Arial"/>
+                <w:sz w:val="18"/>
+              </w:rPr>
+              <w:t>Descifrado, SHA 256, integridad, referencias y esquema compatible.</w:t>
+            </w:r>
+          </w:p>
+        </w:tc>
+      </w:tr>
+      <w:tr>
+        <w:trPr>
+          <w:cantSplit/>
+        </w:trPr>
+        <w:tc>
+          <w:tcPr>
+            <w:tcW w:type="dxa" w:w="2232"/>
+            <w:vAlign w:val="center"/>
+            <w:tcMar>
+              <w:top w:w="120" w:type="dxa"/>
+              <w:start w:w="140" w:type="dxa"/>
+              <w:bottom w:w="120" w:type="dxa"/>
+              <w:end w:w="140" w:type="dxa"/>
+            </w:tcMar>
+            <w:shd w:fill="EEF3F8"/>
+          </w:tcPr>
+          <w:p>
+            <w:pPr>
+              <w:spacing w:after="0"/>
+            </w:pPr>
+            <w:r>
+              <w:rPr>
+                <w:rFonts w:ascii="Arial" w:hAnsi="Arial"/>
+                <w:sz w:val="18"/>
+              </w:rPr>
+              <w:t>Restauracion</w:t>
+            </w:r>
+          </w:p>
+        </w:tc>
+        <w:tc>
+          <w:tcPr>
+            <w:tcW w:type="dxa" w:w="7560"/>
+            <w:vAlign w:val="center"/>
+            <w:tcMar>
+              <w:top w:w="120" w:type="dxa"/>
+              <w:start w:w="140" w:type="dxa"/>
+              <w:bottom w:w="120" w:type="dxa"/>
+              <w:end w:w="140" w:type="dxa"/>
+            </w:tcMar>
+            <w:shd w:fill="EEF3F8"/>
+          </w:tcPr>
+          <w:p>
+            <w:pPr>
+              <w:spacing w:after="0"/>
+            </w:pPr>
+            <w:r>
+              <w:rPr>
+                <w:rFonts w:ascii="Arial" w:hAnsi="Arial"/>
+                <w:sz w:val="18"/>
+              </w:rPr>
+              <w:t>Exige una ruta nueva e invalida sesiones, enlaces y codigos de recuperacion antiguos.</w:t>
+            </w:r>
+          </w:p>
+        </w:tc>
+      </w:tr>
+      <w:tr>
+        <w:trPr>
+          <w:cantSplit/>
+        </w:trPr>
+        <w:tc>
+          <w:tcPr>
+            <w:tcW w:type="dxa" w:w="2232"/>
+            <w:vAlign w:val="center"/>
+            <w:tcMar>
+              <w:top w:w="120" w:type="dxa"/>
+              <w:start w:w="140" w:type="dxa"/>
+              <w:bottom w:w="120" w:type="dxa"/>
+              <w:end w:w="140" w:type="dxa"/>
+            </w:tcMar>
+            <w:shd w:fill="FFFFFF"/>
+          </w:tcPr>
+          <w:p>
+            <w:pPr>
+              <w:spacing w:after="0"/>
+            </w:pPr>
+            <w:r>
+              <w:rPr>
+                <w:rFonts w:ascii="Arial" w:hAnsi="Arial"/>
+                <w:sz w:val="18"/>
+              </w:rPr>
+              <w:t>Programacion</w:t>
+            </w:r>
+          </w:p>
+        </w:tc>
+        <w:tc>
+          <w:tcPr>
+            <w:tcW w:type="dxa" w:w="7560"/>
+            <w:vAlign w:val="center"/>
+            <w:tcMar>
+              <w:top w:w="120" w:type="dxa"/>
+              <w:start w:w="140" w:type="dxa"/>
+              <w:bottom w:w="120" w:type="dxa"/>
+              <w:end w:w="140" w:type="dxa"/>
+            </w:tcMar>
+            <w:shd w:fill="FFFFFF"/>
+          </w:tcPr>
+          <w:p>
+            <w:pPr>
+              <w:spacing w:after="0"/>
+            </w:pPr>
+            <w:r>
+              <w:rPr>
+                <w:rFonts w:ascii="Arial" w:hAnsi="Arial"/>
+                <w:sz w:val="18"/>
+              </w:rPr>
+              <w:t>Intervalo opcional de 1 a 168 horas, sin solapamiento en el trabajador.</w:t>
+            </w:r>
+          </w:p>
+        </w:tc>
+      </w:tr>
+    </w:tbl>
+    <w:p>
+      <w:pPr>
+        <w:pStyle w:val="Heading2"/>
+      </w:pPr>
+      <w:r>
+        <w:t>Como utilizarlo</w:t>
+      </w:r>
+    </w:p>
+    <w:p>
+      <w:pPr>
+        <w:pStyle w:val="ListBullet"/>
+        <w:spacing w:after="80"/>
+      </w:pPr>
+      <w:r>
+        <w:t>Configurar BACKUP_ENCRYPTION_KEY con 64 caracteres hexadecimales aleatorios y custodiar la clave fuera del servidor.</w:t>
+      </w:r>
+    </w:p>
+    <w:p>
+      <w:pPr>
+        <w:pStyle w:val="ListBullet"/>
+        <w:spacing w:after="80"/>
+      </w:pPr>
+      <w:r>
+        <w:t>Crear una copia: npm run db:backup. El resultado indica la carpeta generada.</w:t>
+      </w:r>
+    </w:p>
+    <w:p>
+      <w:pPr>
+        <w:pStyle w:val="ListBullet"/>
+        <w:spacing w:after="80"/>
+      </w:pPr>
+      <w:r>
+        <w:t>Comprobarla: npm run db:verify -- "backups/CARPETA".</w:t>
+      </w:r>
+    </w:p>
+    <w:p>
+      <w:pPr>
+        <w:pStyle w:val="ListBullet"/>
+        <w:spacing w:after="80"/>
+      </w:pPr>
+      <w:r>
+        <w:t>Recuperarla: npm run db:restore -- "backups/CARPETA" "data/recuperada.sqlite".</w:t>
+      </w:r>
+    </w:p>
+    <w:p>
+      <w:pPr>
+        <w:pStyle w:val="ListBullet"/>
+        <w:spacing w:after="80"/>
+      </w:pPr>
+      <w:r>
+        <w:t>Para copias diarias, establecer BACKUP_INTERVAL_HOURS=24 y reiniciar. Con 0 permanecen desactivadas.</w:t>
+      </w:r>
+    </w:p>
+    <w:p>
+      <w:r>
+        <w:t>CARPETA representa el nombre devuelto por la copia. Conservar tambien TOKEN_ENCRYPTION_KEY: es necesaria para OAuth y MFA despues de restaurar. Nunca guardar los valores reales en GitHub, capturas ni informes. La guia tecnica completa esta en docs/29-copias-y-restauracion.md.</w:t>
+      </w:r>
+    </w:p>
+    <w:p>
+      <w:r>
+        <w:br w:type="page"/>
+      </w:r>
+    </w:p>
+    <w:p>
+      <w:pPr>
+        <w:pStyle w:val="Heading1"/>
+      </w:pPr>
+      <w:r>
+        <w:t>Recuperacion y evidencia de funcionamiento</w:t>
+      </w:r>
+    </w:p>
+    <w:p>
+      <w:r>
+        <w:t>Restaurar no cambia automaticamente la base en uso. El administrador del servidor detiene la aplicacion, conserva el archivo anterior, cambia DATABASE_PATH a la ruta recuperada y arranca una sola instancia. Debe revisar usuarios, roles, organizaciones y reportes antes de reabrir el servicio.</w:t>
+      </w:r>
+    </w:p>
+    <w:p>
+      <w:pPr>
+        <w:pStyle w:val="Heading2"/>
+      </w:pPr>
+      <w:r>
+        <w:t>Controles despues de recuperar</w:t>
+      </w:r>
+    </w:p>
+    <w:p>
+      <w:pPr>
+        <w:pStyle w:val="ListBullet"/>
+        <w:spacing w:after="80"/>
+      </w:pPr>
+      <w:r>
+        <w:t>Las sesiones, enlaces temporales y estados OAuth previos dejan de ser validos.</w:t>
+      </w:r>
+    </w:p>
+    <w:p>
+      <w:pPr>
+        <w:pStyle w:val="ListBullet"/>
+        <w:spacing w:after="80"/>
+      </w:pPr>
+      <w:r>
+        <w:t>TOTP permanece activo; los codigos de recuperacion antiguos se eliminan y deben regenerarse desde Cuenta.</w:t>
+      </w:r>
+    </w:p>
+    <w:p>
+      <w:pPr>
+        <w:pStyle w:val="ListBullet"/>
+        <w:spacing w:after="80"/>
+      </w:pPr>
+      <w:r>
+        <w:t>Las sincronizaciones quedan pausadas hasta revisarlas y reactivarlas desde Integraciones.</w:t>
+      </w:r>
+    </w:p>
+    <w:p>
+      <w:pPr>
+        <w:pStyle w:val="ListBullet"/>
+        <w:spacing w:after="80"/>
+      </w:pPr>
+      <w:r>
+        <w:t>Las contrasenas y los permisos vuelven al estado de la copia: revisar cambios o revocaciones posteriores.</w:t>
+      </w:r>
+    </w:p>
+    <w:p>
+      <w:pPr>
+        <w:pStyle w:val="Heading2"/>
+      </w:pPr>
+      <w:r>
+        <w:t>Pruebas realizadas</w:t>
+      </w:r>
+    </w:p>
+    <w:tbl>
+      <w:tblPr>
+        <w:tblW w:type="auto" w:w="0"/>
+        <w:jc w:val="center"/>
+        <w:tblLayout w:type="fixed"/>
+        <w:tblLook w:firstColumn="1" w:firstRow="1" w:lastColumn="0" w:lastRow="0" w:noHBand="0" w:noVBand="1" w:val="04A0"/>
+        <w:tblBorders>
+          <w:top w:val="single" w:sz="6" w:color="D9D9D9"/>
+          <w:left w:val="single" w:sz="6" w:color="D9D9D9"/>
+          <w:bottom w:val="single" w:sz="6" w:color="D9D9D9"/>
+          <w:right w:val="single" w:sz="6" w:color="D9D9D9"/>
+          <w:insideH w:val="single" w:sz="6" w:color="D9D9D9"/>
+          <w:insideV w:val="single" w:sz="6" w:color="D9D9D9"/>
+        </w:tblBorders>
+      </w:tblPr>
+      <w:tblGrid>
+        <w:gridCol w:w="2592"/>
+        <w:gridCol w:w="7200"/>
+      </w:tblGrid>
+      <w:tr>
+        <w:trPr>
+          <w:tblHeader/>
+          <w:cantSplit/>
+        </w:trPr>
+        <w:tc>
+          <w:tcPr>
+            <w:tcW w:type="dxa" w:w="2592"/>
+            <w:vAlign w:val="center"/>
+            <w:tcMar>
+              <w:top w:w="120" w:type="dxa"/>
+              <w:start w:w="140" w:type="dxa"/>
+              <w:bottom w:w="120" w:type="dxa"/>
+              <w:end w:w="140" w:type="dxa"/>
+            </w:tcMar>
+            <w:shd w:fill="17324D"/>
+          </w:tcPr>
+          <w:p>
+            <w:pPr>
+              <w:spacing w:after="0"/>
+            </w:pPr>
+            <w:r>
+              <w:rPr>
+                <w:rFonts w:ascii="Arial" w:hAnsi="Arial"/>
+                <w:b/>
+                <w:color w:val="FFFFFF"/>
+                <w:sz w:val="18"/>
+              </w:rPr>
+              <w:t>Verificacion</w:t>
+            </w:r>
+          </w:p>
+        </w:tc>
+        <w:tc>
+          <w:tcPr>
+            <w:tcW w:type="dxa" w:w="7200"/>
+            <w:vAlign w:val="center"/>
+            <w:tcMar>
+              <w:top w:w="120" w:type="dxa"/>
+              <w:start w:w="140" w:type="dxa"/>
+              <w:bottom w:w="120" w:type="dxa"/>
+              <w:end w:w="140" w:type="dxa"/>
+            </w:tcMar>
+            <w:shd w:fill="17324D"/>
+          </w:tcPr>
+          <w:p>
+            <w:pPr>
+              <w:spacing w:after="0"/>
+            </w:pPr>
+            <w:r>
+              <w:rPr>
+                <w:rFonts w:ascii="Arial" w:hAnsi="Arial"/>
+                <w:b/>
+                <w:color w:val="FFFFFF"/>
+                <w:sz w:val="18"/>
+              </w:rPr>
+              <w:t>Resultado</w:t>
+            </w:r>
+          </w:p>
+        </w:tc>
+      </w:tr>
+      <w:tr>
+        <w:trPr>
+          <w:cantSplit/>
+        </w:trPr>
+        <w:tc>
+          <w:tcPr>
+            <w:tcW w:type="dxa" w:w="2592"/>
+            <w:vAlign w:val="center"/>
+            <w:tcMar>
+              <w:top w:w="120" w:type="dxa"/>
+              <w:start w:w="140" w:type="dxa"/>
+              <w:bottom w:w="120" w:type="dxa"/>
+              <w:end w:w="140" w:type="dxa"/>
+            </w:tcMar>
+            <w:shd w:fill="FFFFFF"/>
+          </w:tcPr>
+          <w:p>
+            <w:pPr>
+              <w:spacing w:after="0"/>
+            </w:pPr>
+            <w:r>
+              <w:rPr>
+                <w:rFonts w:ascii="Arial" w:hAnsi="Arial"/>
+                <w:sz w:val="18"/>
+              </w:rPr>
+              <w:t>Bateria completa</w:t>
+            </w:r>
+          </w:p>
+        </w:tc>
+        <w:tc>
+          <w:tcPr>
+            <w:tcW w:type="dxa" w:w="7200"/>
+            <w:vAlign w:val="center"/>
+            <w:tcMar>
+              <w:top w:w="120" w:type="dxa"/>
+              <w:start w:w="140" w:type="dxa"/>
+              <w:bottom w:w="120" w:type="dxa"/>
+              <w:end w:w="140" w:type="dxa"/>
+            </w:tcMar>
+            <w:shd w:fill="FFFFFF"/>
+          </w:tcPr>
+          <w:p>
+            <w:pPr>
+              <w:spacing w:after="0"/>
+            </w:pPr>
+            <w:r>
+              <w:rPr>
+                <w:rFonts w:ascii="Arial" w:hAnsi="Arial"/>
+                <w:sz w:val="18"/>
+              </w:rPr>
+              <w:t>34 pruebas aprobadas, incluidas 9 de respaldo y recuperacion.</w:t>
+            </w:r>
+          </w:p>
+        </w:tc>
+      </w:tr>
+      <w:tr>
+        <w:trPr>
+          <w:cantSplit/>
+        </w:trPr>
+        <w:tc>
+          <w:tcPr>
+            <w:tcW w:type="dxa" w:w="2592"/>
+            <w:vAlign w:val="center"/>
+            <w:tcMar>
+              <w:top w:w="120" w:type="dxa"/>
+              <w:start w:w="140" w:type="dxa"/>
+              <w:bottom w:w="120" w:type="dxa"/>
+              <w:end w:w="140" w:type="dxa"/>
+            </w:tcMar>
+            <w:shd w:fill="EEF3F8"/>
+          </w:tcPr>
+          <w:p>
+            <w:pPr>
+              <w:spacing w:after="0"/>
+            </w:pPr>
+            <w:r>
+              <w:rPr>
+                <w:rFonts w:ascii="Arial" w:hAnsi="Arial"/>
+                <w:sz w:val="18"/>
+              </w:rPr>
+              <w:t>Recorrido CLI</w:t>
+            </w:r>
+          </w:p>
+        </w:tc>
+        <w:tc>
+          <w:tcPr>
+            <w:tcW w:type="dxa" w:w="7200"/>
+            <w:vAlign w:val="center"/>
+            <w:tcMar>
+              <w:top w:w="120" w:type="dxa"/>
+              <w:start w:w="140" w:type="dxa"/>
+              <w:bottom w:w="120" w:type="dxa"/>
+              <w:end w:w="140" w:type="dxa"/>
+            </w:tcMar>
+            <w:shd w:fill="EEF3F8"/>
+          </w:tcPr>
+          <w:p>
+            <w:pPr>
+              <w:spacing w:after="0"/>
+            </w:pPr>
+            <w:r>
+              <w:rPr>
+                <w:rFonts w:ascii="Arial" w:hAnsi="Arial"/>
+                <w:sz w:val="18"/>
+              </w:rPr>
+              <w:t>Crear, verificar y restaurar funcionan con una base desechable.</w:t>
+            </w:r>
+          </w:p>
+        </w:tc>
+      </w:tr>
+      <w:tr>
+        <w:trPr>
+          <w:cantSplit/>
+        </w:trPr>
+        <w:tc>
+          <w:tcPr>
+            <w:tcW w:type="dxa" w:w="2592"/>
+            <w:vAlign w:val="center"/>
+            <w:tcMar>
+              <w:top w:w="120" w:type="dxa"/>
+              <w:start w:w="140" w:type="dxa"/>
+              <w:bottom w:w="120" w:type="dxa"/>
+              <w:end w:w="140" w:type="dxa"/>
+            </w:tcMar>
+            <w:shd w:fill="FFFFFF"/>
+          </w:tcPr>
+          <w:p>
+            <w:pPr>
+              <w:spacing w:after="0"/>
+            </w:pPr>
+            <w:r>
+              <w:rPr>
+                <w:rFonts w:ascii="Arial" w:hAnsi="Arial"/>
+                <w:sz w:val="18"/>
+              </w:rPr>
+              <w:t>Casos negativos</w:t>
+            </w:r>
+          </w:p>
+        </w:tc>
+        <w:tc>
+          <w:tcPr>
+            <w:tcW w:type="dxa" w:w="7200"/>
+            <w:vAlign w:val="center"/>
+            <w:tcMar>
+              <w:top w:w="120" w:type="dxa"/>
+              <w:start w:w="140" w:type="dxa"/>
+              <w:bottom w:w="120" w:type="dxa"/>
+              <w:end w:w="140" w:type="dxa"/>
+            </w:tcMar>
+            <w:shd w:fill="FFFFFF"/>
+          </w:tcPr>
+          <w:p>
+            <w:pPr>
+              <w:spacing w:after="0"/>
+            </w:pPr>
+            <w:r>
+              <w:rPr>
+                <w:rFonts w:ascii="Arial" w:hAnsi="Arial"/>
+                <w:sz w:val="18"/>
+              </w:rPr>
+              <w:t>Clave incorrecta, archivo alterado, referencias invalidas y destino existente rechazados.</w:t>
+            </w:r>
+          </w:p>
+        </w:tc>
+      </w:tr>
+      <w:tr>
+        <w:trPr>
+          <w:cantSplit/>
+        </w:trPr>
+        <w:tc>
+          <w:tcPr>
+            <w:tcW w:type="dxa" w:w="2592"/>
+            <w:vAlign w:val="center"/>
+            <w:tcMar>
+              <w:top w:w="120" w:type="dxa"/>
+              <w:start w:w="140" w:type="dxa"/>
+              <w:bottom w:w="120" w:type="dxa"/>
+              <w:end w:w="140" w:type="dxa"/>
+            </w:tcMar>
+            <w:shd w:fill="EEF3F8"/>
+          </w:tcPr>
+          <w:p>
+            <w:pPr>
+              <w:spacing w:after="0"/>
+            </w:pPr>
+            <w:r>
+              <w:rPr>
+                <w:rFonts w:ascii="Arial" w:hAnsi="Arial"/>
+                <w:sz w:val="18"/>
+              </w:rPr>
+              <w:t>Programacion</w:t>
+            </w:r>
+          </w:p>
+        </w:tc>
+        <w:tc>
+          <w:tcPr>
+            <w:tcW w:type="dxa" w:w="7200"/>
+            <w:vAlign w:val="center"/>
+            <w:tcMar>
+              <w:top w:w="120" w:type="dxa"/>
+              <w:start w:w="140" w:type="dxa"/>
+              <w:bottom w:w="120" w:type="dxa"/>
+              <w:end w:w="140" w:type="dxa"/>
+            </w:tcMar>
+            <w:shd w:fill="EEF3F8"/>
+          </w:tcPr>
+          <w:p>
+            <w:pPr>
+              <w:spacing w:after="0"/>
+            </w:pPr>
+            <w:r>
+              <w:rPr>
+                <w:rFonts w:ascii="Arial" w:hAnsi="Arial"/>
+                <w:sz w:val="18"/>
+              </w:rPr>
+              <w:t>Repeticion por intervalo, no solapamiento y espera al cerrar comprobados.</w:t>
+            </w:r>
+          </w:p>
+        </w:tc>
+      </w:tr>
+      <w:tr>
+        <w:trPr>
+          <w:cantSplit/>
+        </w:trPr>
+        <w:tc>
+          <w:tcPr>
+            <w:tcW w:type="dxa" w:w="2592"/>
+            <w:vAlign w:val="center"/>
+            <w:tcMar>
+              <w:top w:w="120" w:type="dxa"/>
+              <w:start w:w="140" w:type="dxa"/>
+              <w:bottom w:w="120" w:type="dxa"/>
+              <w:end w:w="140" w:type="dxa"/>
+            </w:tcMar>
+            <w:shd w:fill="FFFFFF"/>
+          </w:tcPr>
+          <w:p>
+            <w:pPr>
+              <w:spacing w:after="0"/>
+            </w:pPr>
+            <w:r>
+              <w:rPr>
+                <w:rFonts w:ascii="Arial" w:hAnsi="Arial"/>
+                <w:sz w:val="18"/>
+              </w:rPr>
+              <w:t>Base original</w:t>
+            </w:r>
+          </w:p>
+        </w:tc>
+        <w:tc>
+          <w:tcPr>
+            <w:tcW w:type="dxa" w:w="7200"/>
+            <w:vAlign w:val="center"/>
+            <w:tcMar>
+              <w:top w:w="120" w:type="dxa"/>
+              <w:start w:w="140" w:type="dxa"/>
+              <w:bottom w:w="120" w:type="dxa"/>
+              <w:end w:w="140" w:type="dxa"/>
+            </w:tcMar>
+            <w:shd w:fill="FFFFFF"/>
+          </w:tcPr>
+          <w:p>
+            <w:pPr>
+              <w:spacing w:after="0"/>
+            </w:pPr>
+            <w:r>
+              <w:rPr>
+                <w:rFonts w:ascii="Arial" w:hAnsi="Arial"/>
+                <w:sz w:val="18"/>
+              </w:rPr>
+              <w:t>No se modifica durante la restauracion; la prueba verifica que conserva sus sesiones y tareas.</w:t>
+            </w:r>
+          </w:p>
+        </w:tc>
+      </w:tr>
+    </w:tbl>
+    <w:p>
+      <w:pPr>
+        <w:pStyle w:val="Heading2"/>
+      </w:pPr>
+      <w:r>
+        <w:t>Lo que aun falta</w:t>
+      </w:r>
+    </w:p>
+    <w:p>
+      <w:r>
+        <w:t>Las copias locales no protegen frente a perder el equipo completo. Faltan almacenamiento externo, retencion, alertas y simulacros productivos. Un cierre forzado puede dejar instantaneas temporales: proteger permisos y cifrado del disco. No hay borrado automatico de copias. PostgreSQL, cola compartida, despliegue productivo y validacion con cuentas sociales reales siguen pendientes. No se contrato ningun servicio.</w:t>
       </w:r>
     </w:p>
     <w:sectPr>

</xml_diff>

<commit_message>
feat: agrega monitoreo HTTP y metricas operativas protegidas
</commit_message>
<xml_diff>
--- a/docs/manuales/Manual-de-avance-Social-Audit-Pro.docx
+++ b/docs/manuales/Manual-de-avance-Social-Audit-Pro.docx
@@ -165,7 +165,7 @@
           </w:tcPr>
           <w:p>
             <w:r>
-              <w:t>v0.5.1</w:t>
+              <w:t>v0.5.2</w:t>
             </w:r>
           </w:p>
         </w:tc>
@@ -210,11 +210,8 @@
             <w:shd w:fill="F7F8FC"/>
           </w:tcPr>
           <w:p>
-            <w:pPr>
-              <w:spacing w:after="0"/>
-            </w:pPr>
-            <w:r>
-              <w:t>25 de septiembre de 2026</w:t>
+            <w:r>
+              <w:t>26 de septiembre de 2026</w:t>
             </w:r>
           </w:p>
         </w:tc>
@@ -253,7 +250,7 @@
           </w:tcPr>
           <w:p>
             <w:r>
-              <w:t>avance-012</w:t>
+              <w:t>avance-013</w:t>
             </w:r>
           </w:p>
         </w:tc>
@@ -12099,6 +12096,394 @@
     <w:p>
       <w:r>
         <w:t>Las copias locales no protegen frente a perder el equipo completo. Faltan almacenamiento externo, retencion, alertas y simulacros productivos. Un cierre forzado puede dejar instantaneas temporales: proteger permisos y cifrado del disco. No hay borrado automatico de copias. PostgreSQL, cola compartida, despliegue productivo y validacion con cuentas sociales reales siguen pendientes. No se contrato ningun servicio.</w:t>
+      </w:r>
+    </w:p>
+    <w:p>
+      <w:r>
+        <w:br w:type="page"/>
+      </w:r>
+    </w:p>
+    <w:p>
+      <w:pPr>
+        <w:pStyle w:val="Heading1"/>
+      </w:pPr>
+      <w:r>
+        <w:t>Monitoreo operativo del servidor</w:t>
+      </w:r>
+    </w:p>
+    <w:p>
+      <w:r>
+        <w:t>Avance 013 de la version v0.5.2, registrado el 26 de septiembre de 2026. El backend permite detectar errores y lentitud mediante registros de solicitudes y estadisticas del proceso. No cambia las pantallas ni contrata servicios. Las 42 pruebas automatizadas pasaron, incluidas ocho nuevas de monitoreo.</w:t>
+      </w:r>
+    </w:p>
+    <w:tbl>
+      <w:tblPr>
+        <w:tblW w:type="auto" w:w="0"/>
+        <w:jc w:val="center"/>
+        <w:tblLayout w:type="fixed"/>
+        <w:tblLook w:firstColumn="1" w:firstRow="1" w:lastColumn="0" w:lastRow="0" w:noHBand="0" w:noVBand="1" w:val="04A0"/>
+        <w:tblBorders>
+          <w:top w:val="single" w:sz="6" w:color="D9D9D9"/>
+          <w:left w:val="single" w:sz="6" w:color="D9D9D9"/>
+          <w:bottom w:val="single" w:sz="6" w:color="D9D9D9"/>
+          <w:right w:val="single" w:sz="6" w:color="D9D9D9"/>
+          <w:insideH w:val="single" w:sz="6" w:color="D9D9D9"/>
+          <w:insideV w:val="single" w:sz="6" w:color="D9D9D9"/>
+        </w:tblBorders>
+      </w:tblPr>
+      <w:tblGrid>
+        <w:gridCol w:w="2232"/>
+        <w:gridCol w:w="7560"/>
+      </w:tblGrid>
+      <w:tr>
+        <w:trPr>
+          <w:tblHeader/>
+          <w:cantSplit/>
+        </w:trPr>
+        <w:tc>
+          <w:tcPr>
+            <w:tcW w:type="dxa" w:w="2232"/>
+            <w:vAlign w:val="center"/>
+            <w:tcMar>
+              <w:top w:w="120" w:type="dxa"/>
+              <w:start w:w="140" w:type="dxa"/>
+              <w:bottom w:w="120" w:type="dxa"/>
+              <w:end w:w="140" w:type="dxa"/>
+            </w:tcMar>
+            <w:shd w:fill="17324D"/>
+          </w:tcPr>
+          <w:p>
+            <w:pPr>
+              <w:spacing w:after="0"/>
+            </w:pPr>
+            <w:r>
+              <w:rPr>
+                <w:rFonts w:ascii="Arial" w:hAnsi="Arial"/>
+                <w:b/>
+                <w:color w:val="FFFFFF"/>
+                <w:sz w:val="18"/>
+              </w:rPr>
+              <w:t>Dato operativo</w:t>
+            </w:r>
+          </w:p>
+        </w:tc>
+        <w:tc>
+          <w:tcPr>
+            <w:tcW w:type="dxa" w:w="7560"/>
+            <w:vAlign w:val="center"/>
+            <w:tcMar>
+              <w:top w:w="120" w:type="dxa"/>
+              <w:start w:w="140" w:type="dxa"/>
+              <w:bottom w:w="120" w:type="dxa"/>
+              <w:end w:w="140" w:type="dxa"/>
+            </w:tcMar>
+            <w:shd w:fill="17324D"/>
+          </w:tcPr>
+          <w:p>
+            <w:pPr>
+              <w:spacing w:after="0"/>
+            </w:pPr>
+            <w:r>
+              <w:rPr>
+                <w:rFonts w:ascii="Arial" w:hAnsi="Arial"/>
+                <w:b/>
+                <w:color w:val="FFFFFF"/>
+                <w:sz w:val="18"/>
+              </w:rPr>
+              <w:t>Para que sirve</w:t>
+            </w:r>
+          </w:p>
+        </w:tc>
+      </w:tr>
+      <w:tr>
+        <w:trPr>
+          <w:cantSplit/>
+        </w:trPr>
+        <w:tc>
+          <w:tcPr>
+            <w:tcW w:type="dxa" w:w="2232"/>
+            <w:vAlign w:val="center"/>
+            <w:tcMar>
+              <w:top w:w="120" w:type="dxa"/>
+              <w:start w:w="140" w:type="dxa"/>
+              <w:bottom w:w="120" w:type="dxa"/>
+              <w:end w:w="140" w:type="dxa"/>
+            </w:tcMar>
+            <w:shd w:fill="FFFFFF"/>
+          </w:tcPr>
+          <w:p>
+            <w:pPr>
+              <w:spacing w:after="0"/>
+            </w:pPr>
+            <w:r>
+              <w:rPr>
+                <w:rFonts w:ascii="Arial" w:hAnsi="Arial"/>
+                <w:sz w:val="18"/>
+              </w:rPr>
+              <w:t>Identificador</w:t>
+            </w:r>
+          </w:p>
+        </w:tc>
+        <w:tc>
+          <w:tcPr>
+            <w:tcW w:type="dxa" w:w="7560"/>
+            <w:vAlign w:val="center"/>
+            <w:tcMar>
+              <w:top w:w="120" w:type="dxa"/>
+              <w:start w:w="140" w:type="dxa"/>
+              <w:bottom w:w="120" w:type="dxa"/>
+              <w:end w:w="140" w:type="dxa"/>
+            </w:tcMar>
+            <w:shd w:fill="FFFFFF"/>
+          </w:tcPr>
+          <w:p>
+            <w:pPr>
+              <w:spacing w:after="0"/>
+            </w:pPr>
+            <w:r>
+              <w:rPr>
+                <w:rFonts w:ascii="Arial" w:hAnsi="Arial"/>
+                <w:sz w:val="18"/>
+              </w:rPr>
+              <w:t>Cada respuesta devuelve X-Request-Id para localizar su registro.</w:t>
+            </w:r>
+          </w:p>
+        </w:tc>
+      </w:tr>
+      <w:tr>
+        <w:trPr>
+          <w:cantSplit/>
+        </w:trPr>
+        <w:tc>
+          <w:tcPr>
+            <w:tcW w:type="dxa" w:w="2232"/>
+            <w:vAlign w:val="center"/>
+            <w:tcMar>
+              <w:top w:w="120" w:type="dxa"/>
+              <w:start w:w="140" w:type="dxa"/>
+              <w:bottom w:w="120" w:type="dxa"/>
+              <w:end w:w="140" w:type="dxa"/>
+            </w:tcMar>
+            <w:shd w:fill="EEF3F8"/>
+          </w:tcPr>
+          <w:p>
+            <w:pPr>
+              <w:spacing w:after="0"/>
+            </w:pPr>
+            <w:r>
+              <w:rPr>
+                <w:rFonts w:ascii="Arial" w:hAnsi="Arial"/>
+                <w:sz w:val="18"/>
+              </w:rPr>
+              <w:t>Solicitudes</w:t>
+            </w:r>
+          </w:p>
+        </w:tc>
+        <w:tc>
+          <w:tcPr>
+            <w:tcW w:type="dxa" w:w="7560"/>
+            <w:vAlign w:val="center"/>
+            <w:tcMar>
+              <w:top w:w="120" w:type="dxa"/>
+              <w:start w:w="140" w:type="dxa"/>
+              <w:bottom w:w="120" w:type="dxa"/>
+              <w:end w:w="140" w:type="dxa"/>
+            </w:tcMar>
+            <w:shd w:fill="EEF3F8"/>
+          </w:tcPr>
+          <w:p>
+            <w:pPr>
+              <w:spacing w:after="0"/>
+            </w:pPr>
+            <w:r>
+              <w:rPr>
+                <w:rFonts w:ascii="Arial" w:hAnsi="Arial"/>
+                <w:sz w:val="18"/>
+              </w:rPr>
+              <w:t>Cuenta respuestas completadas, errores por clase, solicitudes activas y abortos.</w:t>
+            </w:r>
+          </w:p>
+        </w:tc>
+      </w:tr>
+      <w:tr>
+        <w:trPr>
+          <w:cantSplit/>
+        </w:trPr>
+        <w:tc>
+          <w:tcPr>
+            <w:tcW w:type="dxa" w:w="2232"/>
+            <w:vAlign w:val="center"/>
+            <w:tcMar>
+              <w:top w:w="120" w:type="dxa"/>
+              <w:start w:w="140" w:type="dxa"/>
+              <w:bottom w:w="120" w:type="dxa"/>
+              <w:end w:w="140" w:type="dxa"/>
+            </w:tcMar>
+            <w:shd w:fill="FFFFFF"/>
+          </w:tcPr>
+          <w:p>
+            <w:pPr>
+              <w:spacing w:after="0"/>
+            </w:pPr>
+            <w:r>
+              <w:rPr>
+                <w:rFonts w:ascii="Arial" w:hAnsi="Arial"/>
+                <w:sz w:val="18"/>
+              </w:rPr>
+              <w:t>Duraciones</w:t>
+            </w:r>
+          </w:p>
+        </w:tc>
+        <w:tc>
+          <w:tcPr>
+            <w:tcW w:type="dxa" w:w="7560"/>
+            <w:vAlign w:val="center"/>
+            <w:tcMar>
+              <w:top w:w="120" w:type="dxa"/>
+              <w:start w:w="140" w:type="dxa"/>
+              <w:bottom w:w="120" w:type="dxa"/>
+              <w:end w:w="140" w:type="dxa"/>
+            </w:tcMar>
+            <w:shd w:fill="FFFFFF"/>
+          </w:tcPr>
+          <w:p>
+            <w:pPr>
+              <w:spacing w:after="0"/>
+            </w:pPr>
+            <w:r>
+              <w:rPr>
+                <w:rFonts w:ascii="Arial" w:hAnsi="Arial"/>
+                <w:sz w:val="18"/>
+              </w:rPr>
+              <w:t>Mide media, maximo y distribucion acumulada del tiempo de respuesta.</w:t>
+            </w:r>
+          </w:p>
+        </w:tc>
+      </w:tr>
+      <w:tr>
+        <w:trPr>
+          <w:cantSplit/>
+        </w:trPr>
+        <w:tc>
+          <w:tcPr>
+            <w:tcW w:type="dxa" w:w="2232"/>
+            <w:vAlign w:val="center"/>
+            <w:tcMar>
+              <w:top w:w="120" w:type="dxa"/>
+              <w:start w:w="140" w:type="dxa"/>
+              <w:bottom w:w="120" w:type="dxa"/>
+              <w:end w:w="140" w:type="dxa"/>
+            </w:tcMar>
+            <w:shd w:fill="EEF3F8"/>
+          </w:tcPr>
+          <w:p>
+            <w:pPr>
+              <w:spacing w:after="0"/>
+            </w:pPr>
+            <w:r>
+              <w:rPr>
+                <w:rFonts w:ascii="Arial" w:hAnsi="Arial"/>
+                <w:sz w:val="18"/>
+              </w:rPr>
+              <w:t>Proceso</w:t>
+            </w:r>
+          </w:p>
+        </w:tc>
+        <w:tc>
+          <w:tcPr>
+            <w:tcW w:type="dxa" w:w="7560"/>
+            <w:vAlign w:val="center"/>
+            <w:tcMar>
+              <w:top w:w="120" w:type="dxa"/>
+              <w:start w:w="140" w:type="dxa"/>
+              <w:bottom w:w="120" w:type="dxa"/>
+              <w:end w:w="140" w:type="dxa"/>
+            </w:tcMar>
+            <w:shd w:fill="EEF3F8"/>
+          </w:tcPr>
+          <w:p>
+            <w:pPr>
+              <w:spacing w:after="0"/>
+            </w:pPr>
+            <w:r>
+              <w:rPr>
+                <w:rFonts w:ascii="Arial" w:hAnsi="Arial"/>
+                <w:sz w:val="18"/>
+              </w:rPr>
+              <w:t>Informa memoria residente y tiempo activo del monitor.</w:t>
+            </w:r>
+          </w:p>
+        </w:tc>
+      </w:tr>
+    </w:tbl>
+    <w:p>
+      <w:pPr>
+        <w:pStyle w:val="Heading2"/>
+      </w:pPr>
+      <w:r>
+        <w:t>Como se utiliza</w:t>
+      </w:r>
+    </w:p>
+    <w:p>
+      <w:pPr>
+        <w:pStyle w:val="ListBullet"/>
+        <w:spacing w:after="80"/>
+      </w:pPr>
+      <w:r>
+        <w:t>Los registros JSON aparecen en la salida del servidor al atender solicitudes.</w:t>
+      </w:r>
+    </w:p>
+    <w:p>
+      <w:pPr>
+        <w:pStyle w:val="ListBullet"/>
+        <w:spacing w:after="80"/>
+      </w:pPr>
+      <w:r>
+        <w:t>El operador configura OPERATIONS_METRICS_TOKEN con 64 caracteres hexadecimales aleatorios y reinicia.</w:t>
+      </w:r>
+    </w:p>
+    <w:p>
+      <w:pPr>
+        <w:pStyle w:val="ListBullet"/>
+        <w:spacing w:after="80"/>
+      </w:pPr>
+      <w:r>
+        <w:t>Consulta GET /api/v1/operations/metrics con la clave en Authorization Bearer; fuera de localhost debe usar HTTPS.</w:t>
+      </w:r>
+    </w:p>
+    <w:p>
+      <w:pPr>
+        <w:pStyle w:val="ListBullet"/>
+        <w:spacing w:after="80"/>
+      </w:pPr>
+      <w:r>
+        <w:t>Sin clave configurada responde 404; con una clave incorrecta, 401. No se activo en la instalacion local del usuario.</w:t>
+      </w:r>
+    </w:p>
+    <w:p>
+      <w:pPr>
+        <w:pStyle w:val="Heading2"/>
+      </w:pPr>
+      <w:r>
+        <w:t>Privacidad y acceso</w:t>
+      </w:r>
+    </w:p>
+    <w:p>
+      <w:r>
+        <w:t>Los nuevos registros HTTP omiten URL, cuerpos, cookies, tokens, direcciones IP y datos de usuarios o empresas. El identificador lo genera el servidor. Las metricas son globales del proceso: solo el operador con la clave puede consultarlas; los roles de una empresa no dan acceso. La pagina publica de GitHub Pages no tiene este endpoint.</w:t>
+      </w:r>
+    </w:p>
+    <w:p>
+      <w:pPr>
+        <w:pStyle w:val="Heading2"/>
+      </w:pPr>
+      <w:r>
+        <w:t>Limites y siguiente paso</w:t>
+      </w:r>
+    </w:p>
+    <w:p>
+      <w:r>
+        <w:t>Los contadores reinician con el proceso y no incluyen historicos, trazas ni alertas. Compose tiene prevista rotacion de logs, aun pendiente de validacion en Docker. Faltan centralizacion, pruebas de carga, PostgreSQL, cola compartida, despliegue productivo y validacion social con cuentas reales. No se agregaron dependencias ni se modificaron secretos. Guia completa: docs/30-monitoreo-operativo.md.</w:t>
       </w:r>
     </w:p>
     <w:sectPr>

</xml_diff>

<commit_message>
fix: refuerza concurrencia y aislamiento con pruebas de carga
</commit_message>
<xml_diff>
--- a/docs/manuales/Manual-de-avance-Social-Audit-Pro.docx
+++ b/docs/manuales/Manual-de-avance-Social-Audit-Pro.docx
@@ -165,7 +165,7 @@
           </w:tcPr>
           <w:p>
             <w:r>
-              <w:t>v0.5.2</w:t>
+              <w:t>v0.5.3</w:t>
             </w:r>
           </w:p>
         </w:tc>
@@ -250,7 +250,7 @@
           </w:tcPr>
           <w:p>
             <w:r>
-              <w:t>avance-013</w:t>
+              <w:t>avance-014</w:t>
             </w:r>
           </w:p>
         </w:tc>
@@ -12484,6 +12484,423 @@
     <w:p>
       <w:r>
         <w:t>Los contadores reinician con el proceso y no incluyen historicos, trazas ni alertas. Compose tiene prevista rotacion de logs, aun pendiente de validacion en Docker. Faltan centralizacion, pruebas de carga, PostgreSQL, cola compartida, despliegue productivo y validacion social con cuentas reales. No se agregaron dependencias ni se modificaron secretos. Guia completa: docs/30-monitoreo-operativo.md.</w:t>
+      </w:r>
+    </w:p>
+    <w:p>
+      <w:r>
+        <w:br w:type="page"/>
+      </w:r>
+    </w:p>
+    <w:p>
+      <w:pPr>
+        <w:pStyle w:val="Heading1"/>
+      </w:pPr>
+      <w:r>
+        <w:t>Sincronizacion segura y pruebas de carga local</w:t>
+      </w:r>
+    </w:p>
+    <w:p>
+      <w:r>
+        <w:t>Avance 014 de la version v0.5.3 del 26 de septiembre de 2026. Se reforzo el control de sincronizaciones simultaneas y la separacion de empresas. Las 58 pruebas automatizadas pasaron. Una carga local de 500 solicitudes con 10 simultaneas termino sin errores y guardo correctamente 50 reportes en una base desechable.</w:t>
+      </w:r>
+    </w:p>
+    <w:tbl>
+      <w:tblPr>
+        <w:tblW w:type="auto" w:w="0"/>
+        <w:jc w:val="center"/>
+        <w:tblLayout w:type="fixed"/>
+        <w:tblLook w:firstColumn="1" w:firstRow="1" w:lastColumn="0" w:lastRow="0" w:noHBand="0" w:noVBand="1" w:val="04A0"/>
+        <w:tblBorders>
+          <w:top w:val="single" w:sz="6" w:color="D9D9D9"/>
+          <w:left w:val="single" w:sz="6" w:color="D9D9D9"/>
+          <w:bottom w:val="single" w:sz="6" w:color="D9D9D9"/>
+          <w:right w:val="single" w:sz="6" w:color="D9D9D9"/>
+          <w:insideH w:val="single" w:sz="6" w:color="D9D9D9"/>
+          <w:insideV w:val="single" w:sz="6" w:color="D9D9D9"/>
+        </w:tblBorders>
+      </w:tblPr>
+      <w:tblGrid>
+        <w:gridCol w:w="2304"/>
+        <w:gridCol w:w="7488"/>
+      </w:tblGrid>
+      <w:tr>
+        <w:trPr>
+          <w:tblHeader/>
+          <w:cantSplit/>
+        </w:trPr>
+        <w:tc>
+          <w:tcPr>
+            <w:tcW w:type="dxa" w:w="2304"/>
+            <w:vAlign w:val="center"/>
+            <w:tcMar>
+              <w:top w:w="120" w:type="dxa"/>
+              <w:start w:w="140" w:type="dxa"/>
+              <w:bottom w:w="120" w:type="dxa"/>
+              <w:end w:w="140" w:type="dxa"/>
+            </w:tcMar>
+            <w:shd w:fill="17324D"/>
+          </w:tcPr>
+          <w:p>
+            <w:pPr>
+              <w:spacing w:after="0"/>
+            </w:pPr>
+            <w:r>
+              <w:rPr>
+                <w:rFonts w:ascii="Arial" w:hAnsi="Arial"/>
+                <w:b/>
+                <w:color w:val="FFFFFF"/>
+                <w:sz w:val="18"/>
+              </w:rPr>
+              <w:t>Situacion</w:t>
+            </w:r>
+          </w:p>
+        </w:tc>
+        <w:tc>
+          <w:tcPr>
+            <w:tcW w:type="dxa" w:w="7488"/>
+            <w:vAlign w:val="center"/>
+            <w:tcMar>
+              <w:top w:w="120" w:type="dxa"/>
+              <w:start w:w="140" w:type="dxa"/>
+              <w:bottom w:w="120" w:type="dxa"/>
+              <w:end w:w="140" w:type="dxa"/>
+            </w:tcMar>
+            <w:shd w:fill="17324D"/>
+          </w:tcPr>
+          <w:p>
+            <w:pPr>
+              <w:spacing w:after="0"/>
+            </w:pPr>
+            <w:r>
+              <w:rPr>
+                <w:rFonts w:ascii="Arial" w:hAnsi="Arial"/>
+                <w:b/>
+                <w:color w:val="FFFFFF"/>
+                <w:sz w:val="18"/>
+              </w:rPr>
+              <w:t>Comportamiento comprobado</w:t>
+            </w:r>
+          </w:p>
+        </w:tc>
+      </w:tr>
+      <w:tr>
+        <w:trPr>
+          <w:cantSplit/>
+        </w:trPr>
+        <w:tc>
+          <w:tcPr>
+            <w:tcW w:type="dxa" w:w="2304"/>
+            <w:vAlign w:val="center"/>
+            <w:tcMar>
+              <w:top w:w="120" w:type="dxa"/>
+              <w:start w:w="140" w:type="dxa"/>
+              <w:bottom w:w="120" w:type="dxa"/>
+              <w:end w:w="140" w:type="dxa"/>
+            </w:tcMar>
+            <w:shd w:fill="FFFFFF"/>
+          </w:tcPr>
+          <w:p>
+            <w:pPr>
+              <w:spacing w:after="0"/>
+            </w:pPr>
+            <w:r>
+              <w:rPr>
+                <w:rFonts w:ascii="Arial" w:hAnsi="Arial"/>
+                <w:sz w:val="18"/>
+              </w:rPr>
+              <w:t>Dos sincronizaciones</w:t>
+            </w:r>
+          </w:p>
+        </w:tc>
+        <w:tc>
+          <w:tcPr>
+            <w:tcW w:type="dxa" w:w="7488"/>
+            <w:vAlign w:val="center"/>
+            <w:tcMar>
+              <w:top w:w="120" w:type="dxa"/>
+              <w:start w:w="140" w:type="dxa"/>
+              <w:bottom w:w="120" w:type="dxa"/>
+              <w:end w:w="140" w:type="dxa"/>
+            </w:tcMar>
+            <w:shd w:fill="FFFFFF"/>
+          </w:tcPr>
+          <w:p>
+            <w:pPr>
+              <w:spacing w:after="0"/>
+            </w:pPr>
+            <w:r>
+              <w:rPr>
+                <w:rFonts w:ascii="Arial" w:hAnsi="Arial"/>
+                <w:sz w:val="18"/>
+              </w:rPr>
+              <w:t>La manual y la automatica comparten bloqueo; la segunda manual recibe 409 mientras este ocupado.</w:t>
+            </w:r>
+          </w:p>
+        </w:tc>
+      </w:tr>
+      <w:tr>
+        <w:trPr>
+          <w:cantSplit/>
+        </w:trPr>
+        <w:tc>
+          <w:tcPr>
+            <w:tcW w:type="dxa" w:w="2304"/>
+            <w:vAlign w:val="center"/>
+            <w:tcMar>
+              <w:top w:w="120" w:type="dxa"/>
+              <w:start w:w="140" w:type="dxa"/>
+              <w:bottom w:w="120" w:type="dxa"/>
+              <w:end w:w="140" w:type="dxa"/>
+            </w:tcMar>
+            <w:shd w:fill="EEF3F8"/>
+          </w:tcPr>
+          <w:p>
+            <w:pPr>
+              <w:spacing w:after="0"/>
+            </w:pPr>
+            <w:r>
+              <w:rPr>
+                <w:rFonts w:ascii="Arial" w:hAnsi="Arial"/>
+                <w:sz w:val="18"/>
+              </w:rPr>
+              <w:t>Consulta lenta</w:t>
+            </w:r>
+          </w:p>
+        </w:tc>
+        <w:tc>
+          <w:tcPr>
+            <w:tcW w:type="dxa" w:w="7488"/>
+            <w:vAlign w:val="center"/>
+            <w:tcMar>
+              <w:top w:w="120" w:type="dxa"/>
+              <w:start w:w="140" w:type="dxa"/>
+              <w:bottom w:w="120" w:type="dxa"/>
+              <w:end w:w="140" w:type="dxa"/>
+            </w:tcMar>
+            <w:shd w:fill="EEF3F8"/>
+          </w:tcPr>
+          <w:p>
+            <w:pPr>
+              <w:spacing w:after="0"/>
+            </w:pPr>
+            <w:r>
+              <w:rPr>
+                <w:rFonts w:ascii="Arial" w:hAnsi="Arial"/>
+                <w:sz w:val="18"/>
+              </w:rPr>
+              <w:t>El bloqueo se renueva. Al superar 120 segundos, el resultado tardio no se guarda.</w:t>
+            </w:r>
+          </w:p>
+        </w:tc>
+      </w:tr>
+      <w:tr>
+        <w:trPr>
+          <w:cantSplit/>
+        </w:trPr>
+        <w:tc>
+          <w:tcPr>
+            <w:tcW w:type="dxa" w:w="2304"/>
+            <w:vAlign w:val="center"/>
+            <w:tcMar>
+              <w:top w:w="120" w:type="dxa"/>
+              <w:start w:w="140" w:type="dxa"/>
+              <w:bottom w:w="120" w:type="dxa"/>
+              <w:end w:w="140" w:type="dxa"/>
+            </w:tcMar>
+            <w:shd w:fill="FFFFFF"/>
+          </w:tcPr>
+          <w:p>
+            <w:pPr>
+              <w:spacing w:after="0"/>
+            </w:pPr>
+            <w:r>
+              <w:rPr>
+                <w:rFonts w:ascii="Arial" w:hAnsi="Arial"/>
+                <w:sz w:val="18"/>
+              </w:rPr>
+              <w:t>Cambio de acceso</w:t>
+            </w:r>
+          </w:p>
+        </w:tc>
+        <w:tc>
+          <w:tcPr>
+            <w:tcW w:type="dxa" w:w="7488"/>
+            <w:vAlign w:val="center"/>
+            <w:tcMar>
+              <w:top w:w="120" w:type="dxa"/>
+              <w:start w:w="140" w:type="dxa"/>
+              <w:bottom w:w="120" w:type="dxa"/>
+              <w:end w:w="140" w:type="dxa"/>
+            </w:tcMar>
+            <w:shd w:fill="FFFFFF"/>
+          </w:tcPr>
+          <w:p>
+            <w:pPr>
+              <w:spacing w:after="0"/>
+            </w:pPr>
+            <w:r>
+              <w:rPr>
+                <w:rFonts w:ascii="Arial" w:hAnsi="Arial"/>
+                <w:sz w:val="18"/>
+              </w:rPr>
+              <w:t>Revocar la conexion, desactivar la empresa o retirar permisos impide guardar resultados en curso.</w:t>
+            </w:r>
+          </w:p>
+        </w:tc>
+      </w:tr>
+      <w:tr>
+        <w:trPr>
+          <w:cantSplit/>
+        </w:trPr>
+        <w:tc>
+          <w:tcPr>
+            <w:tcW w:type="dxa" w:w="2304"/>
+            <w:vAlign w:val="center"/>
+            <w:tcMar>
+              <w:top w:w="120" w:type="dxa"/>
+              <w:start w:w="140" w:type="dxa"/>
+              <w:bottom w:w="120" w:type="dxa"/>
+              <w:end w:w="140" w:type="dxa"/>
+            </w:tcMar>
+            <w:shd w:fill="EEF3F8"/>
+          </w:tcPr>
+          <w:p>
+            <w:pPr>
+              <w:spacing w:after="0"/>
+            </w:pPr>
+            <w:r>
+              <w:rPr>
+                <w:rFonts w:ascii="Arial" w:hAnsi="Arial"/>
+                <w:sz w:val="18"/>
+              </w:rPr>
+              <w:t>Cuenta de otra empresa</w:t>
+            </w:r>
+          </w:p>
+        </w:tc>
+        <w:tc>
+          <w:tcPr>
+            <w:tcW w:type="dxa" w:w="7488"/>
+            <w:vAlign w:val="center"/>
+            <w:tcMar>
+              <w:top w:w="120" w:type="dxa"/>
+              <w:start w:w="140" w:type="dxa"/>
+              <w:bottom w:w="120" w:type="dxa"/>
+              <w:end w:w="140" w:type="dxa"/>
+            </w:tcMar>
+            <w:shd w:fill="EEF3F8"/>
+          </w:tcPr>
+          <w:p>
+            <w:pPr>
+              <w:spacing w:after="0"/>
+            </w:pPr>
+            <w:r>
+              <w:rPr>
+                <w:rFonts w:ascii="Arial" w:hAnsi="Arial"/>
+                <w:sz w:val="18"/>
+              </w:rPr>
+              <w:t>Los accesos cruzados a reportes, historicos, publicaciones, usuarios y actividad son rechazados o filtrados.</w:t>
+            </w:r>
+          </w:p>
+        </w:tc>
+      </w:tr>
+      <w:tr>
+        <w:trPr>
+          <w:cantSplit/>
+        </w:trPr>
+        <w:tc>
+          <w:tcPr>
+            <w:tcW w:type="dxa" w:w="2304"/>
+            <w:vAlign w:val="center"/>
+            <w:tcMar>
+              <w:top w:w="120" w:type="dxa"/>
+              <w:start w:w="140" w:type="dxa"/>
+              <w:bottom w:w="120" w:type="dxa"/>
+              <w:end w:w="140" w:type="dxa"/>
+            </w:tcMar>
+            <w:shd w:fill="FFFFFF"/>
+          </w:tcPr>
+          <w:p>
+            <w:pPr>
+              <w:spacing w:after="0"/>
+            </w:pPr>
+            <w:r>
+              <w:rPr>
+                <w:rFonts w:ascii="Arial" w:hAnsi="Arial"/>
+                <w:sz w:val="18"/>
+              </w:rPr>
+              <w:t>Retorno de OAuth</w:t>
+            </w:r>
+          </w:p>
+        </w:tc>
+        <w:tc>
+          <w:tcPr>
+            <w:tcW w:type="dxa" w:w="7488"/>
+            <w:vAlign w:val="center"/>
+            <w:tcMar>
+              <w:top w:w="120" w:type="dxa"/>
+              <w:start w:w="140" w:type="dxa"/>
+              <w:bottom w:w="120" w:type="dxa"/>
+              <w:end w:w="140" w:type="dxa"/>
+            </w:tcMar>
+            <w:shd w:fill="FFFFFF"/>
+          </w:tcPr>
+          <w:p>
+            <w:pPr>
+              <w:spacing w:after="0"/>
+            </w:pPr>
+            <w:r>
+              <w:rPr>
+                <w:rFonts w:ascii="Arial" w:hAnsi="Arial"/>
+                <w:sz w:val="18"/>
+              </w:rPr>
+              <w:t>El estado se consume una sola vez; se revalidan permisos y se evita sobrescribir una sincronizacion activa.</w:t>
+            </w:r>
+          </w:p>
+        </w:tc>
+      </w:tr>
+    </w:tbl>
+    <w:p>
+      <w:pPr>
+        <w:pStyle w:val="Heading2"/>
+      </w:pPr>
+      <w:r>
+        <w:t>Como verificarlo</w:t>
+      </w:r>
+    </w:p>
+    <w:p>
+      <w:r>
+        <w:t>npm test ejecuta las 58 pruebas. npm run test:load -- 500 10 inicia un servidor temporal propio, hace consultas autenticadas y crea reportes ficticios. No acepta una pagina externa como destino, no carga los secretos de .env ni usa la base habitual. Al terminar cierra el servidor y elimina su carpeta temporal.</w:t>
+      </w:r>
+    </w:p>
+    <w:p>
+      <w:r>
+        <w:t>GitHub Actions incorpora una carga corta antes de publicar. La evidencia local esta en docs/evidencias/carga-v053.json. La guia tecnica y los limites se encuentran en docs/31-validacion-concurrencia-y-carga.md.</w:t>
+      </w:r>
+    </w:p>
+    <w:p>
+      <w:pPr>
+        <w:pStyle w:val="Heading2"/>
+      </w:pPr>
+      <w:r>
+        <w:t>Que no demuestra esta prueba</w:t>
+      </w:r>
+    </w:p>
+    <w:p>
+      <w:r>
+        <w:t>La carga usa pocos datos y sesiones ya creadas; no mide login, correo ni APIs sociales. No determina cuantos clientes soportara un servidor real ni reemplaza una auditoria externa. Si un SDK ignora cancelacion puede terminar una consulta externa, aunque su resultado ya no se escriba en la base. SQLite sigue siendo de una instancia.</w:t>
+      </w:r>
+    </w:p>
+    <w:p>
+      <w:pPr>
+        <w:pStyle w:val="Heading2"/>
+      </w:pPr>
+      <w:r>
+        <w:t>Trabajo restante</w:t>
+      </w:r>
+    </w:p>
+    <w:p>
+      <w:r>
+        <w:t>La solicitud general aun no esta completada. Faltan credenciales y aprobaciones de redes, validacion real, SMTP y despliegue productivo. Tambien siguen pendientes PostgreSQL, cola compartida, balanceador, copias externas, monitoreo centralizado y pruebas sostenidas. No se contrataron servicios ni se cambiaron las pantallas; la pagina publica sigue siendo una demostracion estatica.</w:t>
       </w:r>
     </w:p>
     <w:sectPr>

</xml_diff>

<commit_message>
feat: portal de clientes y actualizacion al entrar al dashboard
</commit_message>
<xml_diff>
--- a/docs/manuales/Manual-de-avance-Social-Audit-Pro.docx
+++ b/docs/manuales/Manual-de-avance-Social-Audit-Pro.docx
@@ -165,7 +165,7 @@
           </w:tcPr>
           <w:p>
             <w:r>
-              <w:t>v0.5.3</w:t>
+              <w:t>v0.5.4</w:t>
             </w:r>
           </w:p>
         </w:tc>
@@ -250,7 +250,7 @@
           </w:tcPr>
           <w:p>
             <w:r>
-              <w:t>avance-014</w:t>
+              <w:t>avance-015</w:t>
             </w:r>
           </w:p>
         </w:tc>
@@ -12901,6 +12901,127 @@
     <w:p>
       <w:r>
         <w:t>La solicitud general aun no esta completada. Faltan credenciales y aprobaciones de redes, validacion real, SMTP y despliegue productivo. Tambien siguen pendientes PostgreSQL, cola compartida, balanceador, copias externas, monitoreo centralizado y pruebas sostenidas. No se contrataron servicios ni se cambiaron las pantallas; la pagina publica sigue siendo una demostracion estatica.</w:t>
+      </w:r>
+    </w:p>
+    <w:p>
+      <w:r>
+        <w:br w:type="page"/>
+      </w:r>
+    </w:p>
+    <w:p>
+      <w:pPr>
+        <w:pStyle w:val="Heading1"/>
+      </w:pPr>
+      <w:r>
+        <w:t>Acceso de clientes y actualizacion del dashboard</w:t>
+      </w:r>
+    </w:p>
+    <w:p>
+      <w:r>
+        <w:t>Avance 015 del 26 de septiembre de 2026. Se prepararon dos entradas de acceso y un resumen de resultados para clientes. El servidor actualiza las conexiones al ingresar al dashboard, con un intervalo minimo de quince minutos por conexion. Este avance no despliega el backend online ni activa redes sin sus credenciales.</w:t>
+      </w:r>
+    </w:p>
+    <w:p>
+      <w:pPr>
+        <w:pStyle w:val="Heading2"/>
+      </w:pPr>
+      <w:r>
+        <w:t>Uso y permisos</w:t>
+      </w:r>
+    </w:p>
+    <w:p>
+      <w:r>
+        <w:t>Los enlaces #/cuenta/admin y #/cuenta/client comparten la autenticacion existente. El servidor decide el rol real; elegir Administradores no concede privilegios. El administrador crea usuarios en la organizacion correspondiente desde Configuracion. Se propone una organizacion por empresa cliente, pendiente de confirmar si tambien se necesitan restricciones por usuario dentro de la empresa.</w:t>
+      </w:r>
+    </w:p>
+    <w:p>
+      <w:r>
+        <w:t>El cliente ve comunidad, publicaciones, visualizaciones, likes y una tabla de impacto. Las metricas ausentes dicen No disponible. Sin cuentas conectadas no se muestran cifras demostrativas. Cuenta conserva las opciones de seguridad. La simplificacion visual no elimina los permisos analiticos de lectura de su organizacion por API.</w:t>
+      </w:r>
+    </w:p>
+    <w:p>
+      <w:pPr>
+        <w:pStyle w:val="Heading2"/>
+      </w:pPr>
+      <w:r>
+        <w:t>Actualizacion y validacion</w:t>
+      </w:r>
+    </w:p>
+    <w:p>
+      <w:r>
+        <w:t>El refresco usa sesion, CSRF, organizacion activa y el bloqueo compartido. Se limita cada consulta a veinte segundos; ante fallo se conservan los datos anteriores. Los horarios existentes no se desactivan. Se aprobaron 66 pruebas automatizadas y se revisaron ambos accesos y el dashboard cliente en escritorio y movil con datos desechables.</w:t>
+      </w:r>
+    </w:p>
+    <w:p>
+      <w:pPr>
+        <w:pStyle w:val="Heading2"/>
+      </w:pPr>
+      <w:r>
+        <w:t>Decisiones y pendientes</w:t>
+      </w:r>
+    </w:p>
+    <w:p>
+      <w:r>
+        <w:t>Se solicito alojamiento gratuito, prueba con datos reales y posterior uso diario. La gratuidad no garantiza continuidad ni APIs gratuitas para todas las redes. Existe correo empresarial, pero falta confirmar proveedor y configurar el envio. Siguen pendientes PostgreSQL, alojamiento, permisos sociales y validacion productiva. No se contrataron servicios. GitHub Pages sigue siendo una demostracion estatica.</w:t>
+      </w:r>
+    </w:p>
+    <w:p>
+      <w:r>
+        <w:br w:type="page"/>
+      </w:r>
+    </w:p>
+    <w:p>
+      <w:pPr>
+        <w:pStyle w:val="Heading1"/>
+      </w:pPr>
+      <w:r>
+        <w:t>Vista de resultados para clientes</w:t>
+      </w:r>
+    </w:p>
+    <w:p>
+      <w:r>
+        <w:t>Captura de verificacion con cuenta y proveedor simulados. El rotulo Datos oficiales corresponde al estado de interfaz probado, no a una conexion real activada. La metrica ausente se identifica sin inventar valores.</w:t>
+      </w:r>
+    </w:p>
+    <w:p>
+      <w:r>
+        <w:drawing>
+          <wp:inline xmlns:a="http://schemas.openxmlformats.org/drawingml/2006/main" xmlns:pic="http://schemas.openxmlformats.org/drawingml/2006/picture">
+            <wp:extent cx="5760720" cy="4000500"/>
+            <wp:docPr id="7" name="Picture 7"/>
+            <wp:cNvGraphicFramePr>
+              <a:graphicFrameLocks noChangeAspect="1"/>
+            </wp:cNvGraphicFramePr>
+            <a:graphic>
+              <a:graphicData uri="http://schemas.openxmlformats.org/drawingml/2006/picture">
+                <pic:pic>
+                  <pic:nvPicPr>
+                    <pic:cNvPr id="0" name="cliente-desktop.png"/>
+                    <pic:cNvPicPr/>
+                  </pic:nvPicPr>
+                  <pic:blipFill>
+                    <a:blip r:embed="rId18"/>
+                    <a:stretch>
+                      <a:fillRect/>
+                    </a:stretch>
+                  </pic:blipFill>
+                  <pic:spPr>
+                    <a:xfrm>
+                      <a:off x="0" y="0"/>
+                      <a:ext cx="5760720" cy="4000500"/>
+                    </a:xfrm>
+                    <a:prstGeom prst="rect"/>
+                  </pic:spPr>
+                </pic:pic>
+              </a:graphicData>
+            </a:graphic>
+          </wp:inline>
+        </w:drawing>
+      </w:r>
+    </w:p>
+    <w:p>
+      <w:r>
+        <w:t>La revision movil se conserva en docs/assets/portal/cliente-mobile.png. Los dos accesos se documentan con las capturas de la misma carpeta. La guia tecnica completa esta en docs/32-portales-y-actualizacion-dashboard.md.</w:t>
       </w:r>
     </w:p>
     <w:sectPr>

</xml_diff>

<commit_message>
feat: preparar Microsoft 365 y bloquear X por presupuesto
</commit_message>
<xml_diff>
--- a/docs/manuales/Manual-de-avance-Social-Audit-Pro.docx
+++ b/docs/manuales/Manual-de-avance-Social-Audit-Pro.docx
@@ -165,7 +165,7 @@
           </w:tcPr>
           <w:p>
             <w:r>
-              <w:t>v0.5.4</w:t>
+              <w:t>v0.5.5</w:t>
             </w:r>
           </w:p>
         </w:tc>
@@ -250,7 +250,7 @@
           </w:tcPr>
           <w:p>
             <w:r>
-              <w:t>avance-015</w:t>
+              <w:t>avance-016</w:t>
             </w:r>
           </w:p>
         </w:tc>
@@ -13022,6 +13022,137 @@
     <w:p>
       <w:r>
         <w:t>La revision movil se conserva en docs/assets/portal/cliente-mobile.png. Los dos accesos se documentan con las capturas de la misma carpeta. La guia tecnica completa esta en docs/32-portales-y-actualizacion-dashboard.md.</w:t>
+      </w:r>
+    </w:p>
+    <w:p>
+      <w:r>
+        <w:br w:type="page"/>
+      </w:r>
+    </w:p>
+    <w:p>
+      <w:pPr>
+        <w:pStyle w:val="Heading1"/>
+      </w:pPr>
+      <w:r>
+        <w:t>Microsoft 365 y pruebas sin contratar alojamiento</w:t>
+      </w:r>
+    </w:p>
+    <w:p>
+      <w:r>
+        <w:t>Avance 016 del 26 de septiembre de 2026. Se confirmo Microsoft 365, administrado por el jefe, y un piloto gratuito con pausas por inactividad aceptadas. Las empresas deben ver solo sus cuentas designadas y creceran gradualmente, sin un volumen inicial definido. Se pide iniciar pruebas cuanto antes y mantener desactivadas las APIs de pago.</w:t>
+      </w:r>
+    </w:p>
+    <w:p>
+      <w:pPr>
+        <w:pStyle w:val="Heading2"/>
+      </w:pPr>
+      <w:r>
+        <w:t>Lo implementado</w:t>
+      </w:r>
+    </w:p>
+    <w:p>
+      <w:r>
+        <w:t>Se preparo el envio de verificaciones y recuperaciones mediante Microsoft Graph HTTPS. Usa credenciales de aplicacion y un buzon remitente fijo, no la contrasena del jefe. El token temporal se conserva solo en memoria. Las solicitudes tienen limite de tiempo y no siguen redirecciones. Los errores persistidos no guardan mensajes originales que puedan incluir claves o contenido privado. SMTP sigue disponible.</w:t>
+      </w:r>
+    </w:p>
+    <w:p>
+      <w:r>
+        <w:t>X queda bloqueado por defecto aun si existen credenciales guardadas. El bloqueo abarca OAuth, sincronizacion manual, dashboard y trabajador programado. La interfaz indica Desactivada por presupuesto. No se contrataron servicios ni se activaron cuentas externas. Las 76 pruebas automatizadas pasaron con respuestas simuladas.</w:t>
+      </w:r>
+    </w:p>
+    <w:p>
+      <w:pPr>
+        <w:pStyle w:val="Heading2"/>
+      </w:pPr>
+      <w:r>
+        <w:t>Lo que aun no esta activo</w:t>
+      </w:r>
+    </w:p>
+    <w:p>
+      <w:r>
+        <w:t>No se ha verificado un correo real. El jefe debe autorizar la aplicacion y limitar su permiso al buzon designado. La aceptacion HTTP 202 de Graph no garantiza entrega al destinatario. El sistema no reintenta automaticamente el envio para evitar duplicados. Faltan tambien PostgreSQL, backend online y validacion con redes reales. GitHub Pages sigue siendo una demo, no el sistema completo alojado.</w:t>
+      </w:r>
+    </w:p>
+    <w:p>
+      <w:pPr>
+        <w:pStyle w:val="Heading2"/>
+      </w:pPr>
+      <w:r>
+        <w:t>Asignacion por empresa</w:t>
+      </w:r>
+    </w:p>
+    <w:p>
+      <w:r>
+        <w:t>El administrador crea o selecciona la organizacion, conecta sus cuentas y registra los usuarios Cliente dentro de esa empresa. No se deben mezclar empresas distintas en una misma organizacion. La asignacion actual no incluye compartir una cuenta entre empresas ni restringir usuarios individuales de una misma empresa.</w:t>
+      </w:r>
+    </w:p>
+    <w:p>
+      <w:r>
+        <w:br w:type="page"/>
+      </w:r>
+    </w:p>
+    <w:p>
+      <w:pPr>
+        <w:pStyle w:val="Heading1"/>
+      </w:pPr>
+      <w:r>
+        <w:t>Pasos para iniciar el piloto</w:t>
+      </w:r>
+    </w:p>
+    <w:p>
+      <w:r>
+        <w:t>El jefe de Microsoft 365 designa el buzon y autoriza la aplicacion con envio limitado mediante Exchange RBAC. El administrador prepara las cuentas gratuitas del alojamiento y de la base de datos. Los identificadores y secretos se configuran de forma privada en el servidor; nunca se publican en GitHub ni se envian contrasenas por el chat.</w:t>
+      </w:r>
+    </w:p>
+    <w:p>
+      <w:r>
+        <w:t>Antes del piloto online se debe portar SQLite a PostgreSQL y validar permisos, correo, login, aislamiento y consultas reales con pocos usuarios. Las pausas y cuotas del plan gratuito no equivalen a continuidad garantizada. Toda API debe revisarse antes de activarla; el sistema no detecta cambios de tarifas externos.</w:t>
+      </w:r>
+    </w:p>
+    <w:p>
+      <w:r>
+        <w:drawing>
+          <wp:inline xmlns:a="http://schemas.openxmlformats.org/drawingml/2006/main" xmlns:pic="http://schemas.openxmlformats.org/drawingml/2006/picture">
+            <wp:extent cx="4389120" cy="2710927"/>
+            <wp:docPr id="8" name="Picture 8"/>
+            <wp:cNvGraphicFramePr>
+              <a:graphicFrameLocks noChangeAspect="1"/>
+            </wp:cNvGraphicFramePr>
+            <a:graphic>
+              <a:graphicData uri="http://schemas.openxmlformats.org/drawingml/2006/picture">
+                <pic:pic>
+                  <pic:nvPicPr>
+                    <pic:cNvPr id="0" name="x-bloqueado-desktop.png"/>
+                    <pic:cNvPicPr/>
+                  </pic:nvPicPr>
+                  <pic:blipFill>
+                    <a:blip r:embed="rId19"/>
+                    <a:stretch>
+                      <a:fillRect/>
+                    </a:stretch>
+                  </pic:blipFill>
+                  <pic:spPr>
+                    <a:xfrm>
+                      <a:off x="0" y="0"/>
+                      <a:ext cx="4389120" cy="2710927"/>
+                    </a:xfrm>
+                    <a:prstGeom prst="rect"/>
+                  </pic:spPr>
+                </pic:pic>
+              </a:graphicData>
+            </a:graphic>
+          </wp:inline>
+        </w:drawing>
+      </w:r>
+    </w:p>
+    <w:p>
+      <w:r>
+        <w:t>Captura de verificacion local con datos desechables. La API de X permanece bloqueada por presupuesto. Se reviso la misma vista en escritorio y movil.</w:t>
+      </w:r>
+    </w:p>
+    <w:p>
+      <w:r>
+        <w:t>Guia operativa y fuentes oficiales: docs/33-piloto-microsoft365-y-presupuesto.md. La guia especifica las variables del servidor y las comprobaciones de alcance que debe realizar el administrador de Microsoft 365.</w:t>
       </w:r>
     </w:p>
     <w:sectPr>

</xml_diff>

<commit_message>
feat: preparar traslado verificado a PostgreSQL
</commit_message>
<xml_diff>
--- a/docs/manuales/Manual-de-avance-Social-Audit-Pro.docx
+++ b/docs/manuales/Manual-de-avance-Social-Audit-Pro.docx
@@ -165,7 +165,7 @@
           </w:tcPr>
           <w:p>
             <w:r>
-              <w:t>v0.5.5</w:t>
+              <w:t>v0.5.6</w:t>
             </w:r>
           </w:p>
         </w:tc>
@@ -250,7 +250,7 @@
           </w:tcPr>
           <w:p>
             <w:r>
-              <w:t>avance-016</w:t>
+              <w:t>avance-017</w:t>
             </w:r>
           </w:p>
         </w:tc>
@@ -13153,6 +13153,68 @@
     <w:p>
       <w:r>
         <w:t>Guia operativa y fuentes oficiales: docs/33-piloto-microsoft365-y-presupuesto.md. La guia especifica las variables del servidor y las comprobaciones de alcance que debe realizar el administrador de Microsoft 365.</w:t>
+      </w:r>
+    </w:p>
+    <w:p>
+      <w:r>
+        <w:br w:type="page"/>
+      </w:r>
+    </w:p>
+    <w:p>
+      <w:pPr>
+        <w:pStyle w:val="Heading1"/>
+      </w:pPr>
+      <w:r>
+        <w:t>Preparacion del traslado a PostgreSQL</w:t>
+      </w:r>
+    </w:p>
+    <w:p>
+      <w:r>
+        <w:t>Avance 017 del 26 de septiembre de 2026. Se agrego una herramienta para trasladar datos de SQLite a una base PostgreSQL nueva. El traslado se verifica antes de confirmarse. La aplicacion local sigue usando SQLite: todavia no se ha adaptado el backend completo ni se ha desplegado en internet.</w:t>
+      </w:r>
+    </w:p>
+    <w:p>
+      <w:pPr>
+        <w:pStyle w:val="Heading2"/>
+      </w:pPr>
+      <w:r>
+        <w:t>Que conserva y que comprueba</w:t>
+      </w:r>
+    </w:p>
+    <w:p>
+      <w:r>
+        <w:t>Conserva empresas, usuarios, permisos, cuentas, publicaciones, metricas, reportes y secretos cifrados. Comprueba referencias y contenido, rechaza destinos ocupados y cancela la transaccion si falla una comprobacion. Trabaja sobre una instantanea en memoria, sin modificar la base original. Las claves de cifrado deben custodiarse aparte.</w:t>
+      </w:r>
+    </w:p>
+    <w:p>
+      <w:pPr>
+        <w:pStyle w:val="Heading2"/>
+      </w:pPr>
+      <w:r>
+        <w:t>Medidas antes de abrir el nuevo entorno</w:t>
+      </w:r>
+    </w:p>
+    <w:p>
+      <w:r>
+        <w:t>En el destino se invalidan sesiones y enlaces temporales, se pausan sincronizaciones y correos pendientes, y se reinician los codigos de recuperacion MFA. El segundo factor ya habilitado se conserva. El administrador debera verificar acceso, renovar codigos y revisar tareas antes de habilitar usuarios. No se activa ninguna API de pago.</w:t>
+      </w:r>
+    </w:p>
+    <w:p>
+      <w:pPr>
+        <w:pStyle w:val="Heading2"/>
+      </w:pPr>
+      <w:r>
+        <w:t>Evidencia y pendientes</w:t>
+      </w:r>
+    </w:p>
+    <w:p>
+      <w:r>
+        <w:t>Pasaron 84 pruebas automatizadas, incluidas ocho nuevas con PostgreSQL embebido, SQLite y la herramienta de consola. La construccion publica paso y la carga local de 200 solicitudes no tuvo errores. El workflow incorpora una prueba adicional contra PostgreSQL 16 servidor con datos desechables y dos conexiones.</w:t>
+      </w:r>
+    </w:p>
+    <w:p>
+      <w:r>
+        <w:t>Falta adaptar las consultas y transacciones del backend a PostgreSQL, desplegarlo y activar correo y redes con autorizaciones reales. No se contrataron servicios ni se trasladaron datos reales. La pagina publica sigue siendo una demo. Guia operativa: docs/34-traslado-postgresql.md.</w:t>
       </w:r>
     </w:p>
     <w:sectPr>

</xml_diff>

<commit_message>
feat: adaptar sesiones y limite de acceso a PostgreSQL
</commit_message>
<xml_diff>
--- a/docs/manuales/Manual-de-avance-Social-Audit-Pro.docx
+++ b/docs/manuales/Manual-de-avance-Social-Audit-Pro.docx
@@ -165,7 +165,7 @@
           </w:tcPr>
           <w:p>
             <w:r>
-              <w:t>v0.5.6</w:t>
+              <w:t>v0.5.7</w:t>
             </w:r>
           </w:p>
         </w:tc>
@@ -250,7 +250,7 @@
           </w:tcPr>
           <w:p>
             <w:r>
-              <w:t>avance-017</w:t>
+              <w:t>avance-018</w:t>
             </w:r>
           </w:p>
         </w:tc>
@@ -13215,6 +13215,68 @@
     <w:p>
       <w:r>
         <w:t>Falta adaptar las consultas y transacciones del backend a PostgreSQL, desplegarlo y activar correo y redes con autorizaciones reales. No se contrataron servicios ni se trasladaron datos reales. La pagina publica sigue siendo una demo. Guia operativa: docs/34-traslado-postgresql.md.</w:t>
+      </w:r>
+    </w:p>
+    <w:p>
+      <w:r>
+        <w:br w:type="page"/>
+      </w:r>
+    </w:p>
+    <w:p>
+      <w:pPr>
+        <w:pStyle w:val="Heading1"/>
+      </w:pPr>
+      <w:r>
+        <w:t>Primeras operaciones del backend en PostgreSQL</w:t>
+      </w:r>
+    </w:p>
+    <w:p>
+      <w:r>
+        <w:t>Avance 018 del 26 de septiembre de 2026. Se adapto la lectura de sesiones y el limite de intentos de acceso para trabajar con SQLite o PostgreSQL. El sistema completo todavia inicia con SQLite. Las pruebas PostgreSQL usan sesiones preparadas para validacion, no un registro o inicio de sesion completo del producto.</w:t>
+      </w:r>
+    </w:p>
+    <w:p>
+      <w:pPr>
+        <w:pStyle w:val="Heading2"/>
+      </w:pPr>
+      <w:r>
+        <w:t>Que mejora</w:t>
+      </w:r>
+    </w:p>
+    <w:p>
+      <w:r>
+        <w:t>El servidor sigue comprobando usuario, rol y empresa antes de aceptar la sesion. Ahora interpreta las fechas de vencimiento correctamente aunque tengan formato ISO o un desplazamiento horario. Conserva permisos y proteccion CSRF. Un fallo de base no concede acceso ni permite continuar al controlador protegido.</w:t>
+      </w:r>
+    </w:p>
+    <w:p>
+      <w:r>
+        <w:t>El limite agrupa conteo e insercion de intentos para evitar que solicitudes simultaneas superen el maximo. PostgreSQL utiliza un bloqueo compartido por clave. Tambien se preparo un grupo acotado de conexiones, con TLS validado, UTC, tiempos maximos y transacciones que liberan o descartan la conexion segun el resultado.</w:t>
+      </w:r>
+    </w:p>
+    <w:p>
+      <w:pPr>
+        <w:pStyle w:val="Heading2"/>
+      </w:pPr>
+      <w:r>
+        <w:t>Pruebas y continuidad</w:t>
+      </w:r>
+    </w:p>
+    <w:p>
+      <w:r>
+        <w:t>Pasaron 96 pruebas automatizadas y la construccion publica. La carga local ejecuto 200 solicitudes sin errores. La prueba del servidor PostgreSQL en GitHub usa dos grupos de conexiones y 30 intentos concurrentes para comprobar el limite. La version local conserva sus funciones y la publica sigue siendo una demo.</w:t>
+      </w:r>
+    </w:p>
+    <w:p>
+      <w:pPr>
+        <w:pStyle w:val="Heading2"/>
+      </w:pPr>
+      <w:r>
+        <w:t>Trabajo que sigue pendiente</w:t>
+      </w:r>
+    </w:p>
+    <w:p>
+      <w:r>
+        <w:t>Falta adaptar a PostgreSQL las demas operaciones de autenticacion, organizaciones, analitica, reportes e integraciones y los trabajadores. Esas funciones siguen disponibles con SQLite. Despues se podra seleccionar el motor y desplegar el piloto. No se trasladaron datos reales ni se contrataron servicios. Correo y redes oficiales siguen pendientes de autorizaciones. Guia: docs/35-acceso-asincrono-postgresql.md.</w:t>
       </w:r>
     </w:p>
     <w:sectPr>

</xml_diff>

<commit_message>
feat: portar recuperacion y correo a repositorios PostgreSQL
</commit_message>
<xml_diff>
--- a/docs/manuales/Manual-de-avance-Social-Audit-Pro.docx
+++ b/docs/manuales/Manual-de-avance-Social-Audit-Pro.docx
@@ -165,7 +165,7 @@
           </w:tcPr>
           <w:p>
             <w:r>
-              <w:t>v0.5.7</w:t>
+              <w:t>v0.5.8</w:t>
             </w:r>
           </w:p>
         </w:tc>
@@ -250,7 +250,7 @@
           </w:tcPr>
           <w:p>
             <w:r>
-              <w:t>avance-018</w:t>
+              <w:t>avance-019</w:t>
             </w:r>
           </w:p>
         </w:tc>
@@ -13277,6 +13277,68 @@
     <w:p>
       <w:r>
         <w:t>Falta adaptar a PostgreSQL las demas operaciones de autenticacion, organizaciones, analitica, reportes e integraciones y los trabajadores. Esas funciones siguen disponibles con SQLite. Despues se podra seleccionar el motor y desplegar el piloto. No se trasladaron datos reales ni se contrataron servicios. Correo y redes oficiales siguen pendientes de autorizaciones. Guia: docs/35-acceso-asincrono-postgresql.md.</w:t>
+      </w:r>
+    </w:p>
+    <w:p>
+      <w:r>
+        <w:br w:type="page"/>
+      </w:r>
+    </w:p>
+    <w:p>
+      <w:pPr>
+        <w:pStyle w:val="Heading1"/>
+      </w:pPr>
+      <w:r>
+        <w:t>Recuperacion de cuenta preparada para PostgreSQL</w:t>
+      </w:r>
+    </w:p>
+    <w:p>
+      <w:r>
+        <w:t>Avance 019 del 26 de septiembre de 2026. La recuperacion de contrasena y la verificacion de correo ya se prueban con los mismos endpoints en SQLite y PostgreSQL. El servidor local completo sigue usando SQLite; no se ha desplegado un backend nuevo ni se ha activado el correo empresarial.</w:t>
+      </w:r>
+    </w:p>
+    <w:p>
+      <w:pPr>
+        <w:pStyle w:val="Heading2"/>
+      </w:pPr>
+      <w:r>
+        <w:t>Que cambia para la seguridad</w:t>
+      </w:r>
+    </w:p>
+    <w:p>
+      <w:r>
+        <w:t>Cada nuevo enlace sustituye al anterior de su mismo tipo. Solo se puede completar una vez, incluso con solicitudes simultaneas. El sistema rechaza enlaces vencidos y cuentas desactivadas. Al restablecer la contrasena se cierran las sesiones y se invalidan los desafios de acceso pendientes, dentro de una sola transaccion.</w:t>
+      </w:r>
+    </w:p>
+    <w:p>
+      <w:r>
+        <w:t>El segundo factor ya activo se conserva; una configuracion de 2FA que todavia no se habia confirmado se elimina. El registro de correos conserva destinatario, asunto y estado, sin guardar el cuerpo ni enlaces secretos. Si falla la base despues de que el proveedor acepte un correo, no se reenvia automaticamente ni se atribuye el fallo al proveedor. La aceptacion tampoco garantiza llegada al buzon.</w:t>
+      </w:r>
+    </w:p>
+    <w:p>
+      <w:pPr>
+        <w:pStyle w:val="Heading2"/>
+      </w:pPr>
+      <w:r>
+        <w:t>Pruebas realizadas</w:t>
+      </w:r>
+    </w:p>
+    <w:p>
+      <w:r>
+        <w:t>Pasaron 105 pruebas automatizadas, la construccion publica y 200 solicitudes de carga local sin errores. Los contratos comprueban recuperacion, verificacion, caducidad, aislamiento, rollback y privacidad. La prueba PostgreSQL del workflow incluye solicitudes concurrentes desde dos grupos de conexiones. Todos los correos de prueba son capturados o simulados; no se envio correo real.</w:t>
+      </w:r>
+    </w:p>
+    <w:p>
+      <w:pPr>
+        <w:pStyle w:val="Heading2"/>
+      </w:pPr>
+      <w:r>
+        <w:t>Lo que queda pendiente</w:t>
+      </w:r>
+    </w:p>
+    <w:p>
+      <w:r>
+        <w:t>Faltan registro, login y gestion 2FA completos sobre PostgreSQL, ademas de los modulos de datos y trabajadores. Esas funciones siguen disponibles localmente con SQLite. La publica permanece como demo estatica. Siguen pendientes autorizaciones sociales, Microsoft 365, alojamiento y pruebas reales. No se contrataron servicios. Detalle tecnico: docs/36-recuperacion-postgresql.md.</w:t>
       </w:r>
     </w:p>
     <w:sectPr>

</xml_diff>